<commit_message>
docs: publish English project materials
</commit_message>
<xml_diff>
--- a/outputs/connact-ai-design-package/connact-ai-detailed-design.docx
+++ b/outputs/connact-ai-design-package/connact-ai-detailed-design.docx
@@ -7,7 +7,7 @@
         <w:pStyle w:val="Title"/>
       </w:pPr>
       <w:r>
-        <w:t>Connact.ai 金融人脉与邮件写作工作台</w:t>
+        <w:t>Connact.ai Financial Networking &amp; Email Writing Workbench</w:t>
       </w:r>
     </w:p>
     <w:p>
@@ -15,17 +15,17 @@
         <w:pStyle w:val="Subtitle"/>
       </w:pPr>
       <w:r>
-        <w:t>产品详细设计与四期开发规格</w:t>
+        <w:t>Product Detailed Design and Four-Phase Development Specifications</w:t>
       </w:r>
     </w:p>
     <w:p>
       <w:r>
-        <w:t>本设计用于把金融人脉拓展需求拆成可以独立开发、逐期验证的产品。第一期只打通简历、找人、AI 写作与草稿，第二期才接入账户及真实 Gmail，第三期加入收件箱和手动跟进，第四期完善批量活动。核心设计重点是让用户知道 AI 使用了什么事实、改了什么内容，以及哪些结果尚未确认。</w:t>
+        <w:t>This design breaks down the financial networking expansion requirements into independently developable, phased-validated products. Phase 1 connects resume, people search, AI writing, and draft; Phase 2 integrates account and real Gmail; Phase 3 adds inbox and manual follow-up; Phase 4 completes batch activities. Core design focuses on letting users know what facts the AI used, what content was changed, and which results remain unverified.</w:t>
       </w:r>
     </w:p>
     <w:p>
       <w:r>
-        <w:t>已确认范围：个人工作区可连接多个 Gmail；团队仅预留；英文界面默认并支持简体中文；邮件生成语言独立。Finance 完整建设，Academic 只保留入口和扩展契约。四期均不包括自动邮件序列。</w:t>
+        <w:t>Confirmed Scope: Personal workspace can connect multiple Gmail mailboxes; team mode is reserved; English interface is default and supports Simplified Chinese; email generation language is independent. Finance is fully built; Academic only retains entry and extension agreement. No automated email sequences are included in any phase.</w:t>
       </w:r>
     </w:p>
     <w:tbl>
@@ -73,7 +73,7 @@
                 <w:color w:val="FFFFFF"/>
                 <w:sz w:val="18"/>
               </w:rPr>
-              <w:t>期次</w:t>
+              <w:t>Phase</w:t>
             </w:r>
           </w:p>
         </w:tc>
@@ -105,7 +105,7 @@
                 <w:color w:val="FFFFFF"/>
                 <w:sz w:val="18"/>
               </w:rPr>
-              <w:t>用户可完成的事情</w:t>
+              <w:t>Tasks users can complete</w:t>
             </w:r>
           </w:p>
         </w:tc>
@@ -137,7 +137,7 @@
                 <w:color w:val="FFFFFF"/>
                 <w:sz w:val="18"/>
               </w:rPr>
-              <w:t>结束位置</w:t>
+              <w:t>End position</w:t>
             </w:r>
           </w:p>
         </w:tc>
@@ -206,7 +206,7 @@
                 <w:color w:val="000000"/>
                 <w:sz w:val="18"/>
               </w:rPr>
-              <w:t>上传或手动画像 → 搜索 → 保存联系人 → 写信 → 预览并保存草稿</w:t>
+              <w:t>Upload or manually create persona → search → save contact → write letter → preview and save draft</w:t>
             </w:r>
           </w:p>
         </w:tc>
@@ -238,7 +238,7 @@
                 <w:color w:val="000000"/>
                 <w:sz w:val="18"/>
               </w:rPr>
-              <w:t>画像、联系人和草稿持久化</w:t>
+              <w:t>Persona, contact, and draft persistence</w:t>
             </w:r>
           </w:p>
         </w:tc>
@@ -307,7 +307,7 @@
                 <w:color w:val="000000"/>
                 <w:sz w:val="18"/>
               </w:rPr>
-              <w:t>登录 → 多 Gmail → 预检 → 测试/正式/定时单封发送</w:t>
+              <w:t>Login → multiple Gmail → pre-check → test/send single email in test/formal/scheduled mode</w:t>
             </w:r>
           </w:p>
         </w:tc>
@@ -339,7 +339,7 @@
                 <w:color w:val="000000"/>
                 <w:sz w:val="18"/>
               </w:rPr>
-              <w:t>两用户隔离</w:t>
+              <w:t>Two-user isolation</w:t>
             </w:r>
           </w:p>
         </w:tc>
@@ -408,7 +408,7 @@
                 <w:color w:val="000000"/>
                 <w:sz w:val="18"/>
               </w:rPr>
-              <w:t>同步邮件 → 原会话回复 → 创建提醒 → 主动跟进</w:t>
+              <w:t>Synchronize emails → original thread reply → create reminder → active follow-up</w:t>
             </w:r>
           </w:p>
         </w:tc>
@@ -440,7 +440,7 @@
                 <w:color w:val="000000"/>
                 <w:sz w:val="18"/>
               </w:rPr>
-              <w:t>真实回复同步</w:t>
+              <w:t>Real reply synchronization</w:t>
             </w:r>
           </w:p>
         </w:tc>
@@ -509,7 +509,7 @@
                 <w:color w:val="000000"/>
                 <w:sz w:val="18"/>
               </w:rPr>
-              <w:t>模板 → 逐人预览 → 批量批准 → 活动控制 → 统计</w:t>
+              <w:t>Template → preview per person → batch approve → activity control → statistics</w:t>
             </w:r>
           </w:p>
         </w:tc>
@@ -541,7 +541,7 @@
                 <w:color w:val="000000"/>
                 <w:sz w:val="18"/>
               </w:rPr>
-              <w:t>逐人发送、取消生效、统计口径可核对</w:t>
+              <w:t>Per-person sending, cancel effect, metric definitions are verifiable</w:t>
             </w:r>
           </w:p>
         </w:tc>
@@ -553,17 +553,17 @@
         <w:pStyle w:val="Heading2"/>
       </w:pPr>
       <w:r>
-        <w:t>如何使用本交付包</w:t>
+        <w:t>How to Use This Delivery Package</w:t>
       </w:r>
     </w:p>
     <w:p>
       <w:r>
-        <w:t>Word 是产品和工程的设计依据；HTML 是可点击的离线演示，所有人名和数据为虚构示例；XLSX 是带需求 ID、依赖和验收的功能台账；四份 Markdown prompt 用于在同一个代码库逐期开发。功能表中的“未开始”表示尚未开发产品，不代表设计工作未完成。</w:t>
+        <w:t>Word is the design basis for product and engineering; HTML is an interactive offline demo, with all names and data as fictional examples; XLSX is a functional ledger with requirement ID, dependencies, and acceptance criteria; four Markdown prompts are used for incremental development in the same codebase. 'Not Started' in the feature table means the product is not yet developed, and does not indicate that design work is incomplete.</w:t>
       </w:r>
     </w:p>
     <w:p>
       <w:r>
-        <w:t>本版含四期 58 项功能、Soon 管理员后端 9 项待办与 22 个验收场景。页面宽度、生成长度和轮询频率属于建议默认值，可以在开发中调整；范围与“不自动发下一封”的行为是已确认约束。</w:t>
+        <w:t>This version includes 58 features across four phases, 9 pending tasks for Soon administrator backend, and 22 acceptance scenarios. Page width, generation length, and polling frequency are suggested default values that can be adjusted during development; scope and 'Do Not Automatically Send Next Email' behavior are confirmed constraints.</w:t>
       </w:r>
     </w:p>
     <w:p>
@@ -576,12 +576,12 @@
         <w:pStyle w:val="Heading1"/>
       </w:pPr>
       <w:r>
-        <w:t>01 信息架构与工作台布局</w:t>
+        <w:t>01 Information Architecture and Workbench Layout</w:t>
       </w:r>
     </w:p>
     <w:p>
       <w:r>
-        <w:t>页面组织围绕可独立使用的模块。用户不必从 Dashboard 开始，也不必上传简历才能搜索或手写邮件。Finance 页面聚合相关入口和活动，不维护第二套联系人或草稿。</w:t>
+        <w:t>Page organization centers around independently usable modules. Users do not need to start from Dashboard or upload a resume to search or handwrite an email. Finance page aggregates relevant entries and activities, without maintaining a second set of contacts or drafts.</w:t>
       </w:r>
     </w:p>
     <w:tbl>
@@ -629,7 +629,7 @@
                 <w:color w:val="FFFFFF"/>
                 <w:sz w:val="18"/>
               </w:rPr>
-              <w:t>区域</w:t>
+              <w:t>Region</w:t>
             </w:r>
           </w:p>
         </w:tc>
@@ -661,7 +661,7 @@
                 <w:color w:val="FFFFFF"/>
                 <w:sz w:val="18"/>
               </w:rPr>
-              <w:t>桌面建议</w:t>
+              <w:t>Desktop suggestions</w:t>
             </w:r>
           </w:p>
         </w:tc>
@@ -693,7 +693,7 @@
                 <w:color w:val="FFFFFF"/>
                 <w:sz w:val="18"/>
               </w:rPr>
-              <w:t>交互规则</w:t>
+              <w:t>Interaction rules</w:t>
             </w:r>
           </w:p>
         </w:tc>
@@ -730,7 +730,7 @@
                 <w:color w:val="000000"/>
                 <w:sz w:val="18"/>
               </w:rPr>
-              <w:t>左导航</w:t>
+              <w:t>Left navigation</w:t>
             </w:r>
           </w:p>
         </w:tc>
@@ -762,7 +762,7 @@
                 <w:color w:val="000000"/>
                 <w:sz w:val="18"/>
               </w:rPr>
-              <w:t>约 216 px，可折叠</w:t>
+              <w:t>About 216 px, collapsible</w:t>
             </w:r>
           </w:p>
         </w:tc>
@@ -794,7 +794,7 @@
                 <w:color w:val="000000"/>
                 <w:sz w:val="18"/>
               </w:rPr>
-              <w:t>当前页面高亮；未来模块显示 Coming Soon</w:t>
+              <w:t>Current page highlighted; future modules show Coming Soon</w:t>
             </w:r>
           </w:p>
         </w:tc>
@@ -831,7 +831,7 @@
                 <w:color w:val="000000"/>
                 <w:sz w:val="18"/>
               </w:rPr>
-              <w:t>顶部</w:t>
+              <w:t>Top</w:t>
             </w:r>
           </w:p>
         </w:tc>
@@ -863,7 +863,7 @@
                 <w:color w:val="000000"/>
                 <w:sz w:val="18"/>
               </w:rPr>
-              <w:t>约 64 px</w:t>
+              <w:t>About 64 px</w:t>
             </w:r>
           </w:p>
         </w:tc>
@@ -895,7 +895,7 @@
                 <w:color w:val="000000"/>
                 <w:sz w:val="18"/>
               </w:rPr>
-              <w:t>页面标题、领域、语言、工作区；不重复放全部操作</w:t>
+              <w:t>Page title, domain, language, workspace; do not repeat all operations</w:t>
             </w:r>
           </w:p>
         </w:tc>
@@ -932,7 +932,7 @@
                 <w:color w:val="000000"/>
                 <w:sz w:val="18"/>
               </w:rPr>
-              <w:t>主内容区</w:t>
+              <w:t>Main content area</w:t>
             </w:r>
           </w:p>
         </w:tc>
@@ -964,7 +964,7 @@
                 <w:color w:val="000000"/>
                 <w:sz w:val="18"/>
               </w:rPr>
-              <w:t>24 px 外边距，8 px 间距基准</w:t>
+              <w:t>24 px margin, 8 px spacing baseline</w:t>
             </w:r>
           </w:p>
         </w:tc>
@@ -996,7 +996,7 @@
                 <w:color w:val="000000"/>
                 <w:sz w:val="18"/>
               </w:rPr>
-              <w:t>表格页可滚动；编辑页突出邮件正文</w:t>
+              <w:t>Scrollable table pages; highlight email body in edit pages</w:t>
             </w:r>
           </w:p>
         </w:tc>
@@ -1033,7 +1033,7 @@
                 <w:color w:val="000000"/>
                 <w:sz w:val="18"/>
               </w:rPr>
-              <w:t>联系人侧栏</w:t>
+              <w:t>Contact sidebar</w:t>
             </w:r>
           </w:p>
         </w:tc>
@@ -1065,7 +1065,7 @@
                 <w:color w:val="000000"/>
                 <w:sz w:val="18"/>
               </w:rPr>
-              <w:t>约 300–340 px</w:t>
+              <w:t>About 300–340 px</w:t>
             </w:r>
           </w:p>
         </w:tc>
@@ -1097,7 +1097,7 @@
                 <w:color w:val="000000"/>
                 <w:sz w:val="18"/>
               </w:rPr>
-              <w:t>资料与来源就地查看，不让用户丢失搜索状态</w:t>
+              <w:t>View data and sources in place, so users don't lose search state</w:t>
             </w:r>
           </w:p>
         </w:tc>
@@ -1134,7 +1134,7 @@
                 <w:color w:val="000000"/>
                 <w:sz w:val="18"/>
               </w:rPr>
-              <w:t>窄屏</w:t>
+              <w:t>Narrow screen</w:t>
             </w:r>
           </w:p>
         </w:tc>
@@ -1166,7 +1166,7 @@
                 <w:color w:val="000000"/>
                 <w:sz w:val="18"/>
               </w:rPr>
-              <w:t>小于约 1024 px 收起侧栏</w:t>
+              <w:t>Collapse sidebar if less than about 1024 px</w:t>
             </w:r>
           </w:p>
         </w:tc>
@@ -1198,7 +1198,7 @@
                 <w:color w:val="000000"/>
                 <w:sz w:val="18"/>
               </w:rPr>
-              <w:t>单栏展示；切换资料与编辑区，保留草稿</w:t>
+              <w:t>Single-column display; switch between data and edit areas, keeping draft</w:t>
             </w:r>
           </w:p>
         </w:tc>
@@ -1210,12 +1210,12 @@
         <w:pStyle w:val="Heading2"/>
       </w:pPr>
       <w:r>
-        <w:t>导航与领域</w:t>
+        <w:t>Navigation and Domains</w:t>
       </w:r>
     </w:p>
     <w:p>
       <w:r>
-        <w:t>Overview 包含 Dashboard。Domains 包含 Finance 与 Academic。Workspace 包含 People Search、Contacts、Email Studio、Templates、Campaigns、Inbox。Management 包含 Mailboxes、Personas、Analytics 与 Settings。第一期只有画像、搜索、联系人和编辑可用，其他页面说明将在哪一期启用。</w:t>
+        <w:t>Overview includes Dashboard. Domains include Finance and Academic. Workspace includes People Search, Contacts, Email Studio, Templates, Campaigns, and Inbox. Management includes Mailboxes, Personas, Analytics, and Settings. Only Personas, Search, Contacts, and Edit are available in Phase 1; other page descriptions will be enabled in the respective phases.</w:t>
       </w:r>
     </w:p>
     <w:p>
@@ -1223,12 +1223,12 @@
         <w:pStyle w:val="Heading2"/>
       </w:pPr>
       <w:r>
-        <w:t>页面状态</w:t>
+        <w:t>Page States</w:t>
       </w:r>
     </w:p>
     <w:p>
       <w:r>
-        <w:t>每个页面必须覆盖 loading、empty、error、partial 和 ready；外部数据模块另有 unconfigured 与 rate_limited。无邮箱不阻止写信，只影响第二期发送。用户切换领域不会自动删除筛选或草稿，也不会将无领域的 Gmail 会话错误归入 Finance。</w:t>
+        <w:t>Each page must cover loading, empty, error, partial, and ready states; external data modules have unconfigured and rate_limited. No email address prevents writing, only affects sending in Phase 2. Switching domains does not automatically delete filters or drafts, nor does it incorrectly assign Gmail sessions without a domain to Finance.</w:t>
       </w:r>
     </w:p>
     <w:p>
@@ -1236,12 +1236,12 @@
         <w:pStyle w:val="Heading2"/>
       </w:pPr>
       <w:r>
-        <w:t>界面语言</w:t>
+        <w:t>Interface Language</w:t>
       </w:r>
     </w:p>
     <w:p>
       <w:r>
-        <w:t>默认英文；简体中文切换覆盖主要按钮、表单、验证信息和空状态。用户填写的姓名、备注和正文不随界面切换而翻译。邮件语言保存在写作 Brief 内，生成时明确使用，改写默认继承。</w:t>
+        <w:t>Default is English; Simplified Chinese switch covers main buttons, forms, validation messages, and empty states. User-entered names, notes, and body text are not translated with interface switching. Email language is saved in the writing Brief, used explicitly during generation, and rewritten by default.</w:t>
       </w:r>
     </w:p>
     <w:p>
@@ -1254,7 +1254,7 @@
         <w:pStyle w:val="Heading1"/>
       </w:pPr>
       <w:r>
-        <w:t>02 简历到联系人</w:t>
+        <w:t>02 Resume to Contact</w:t>
       </w:r>
     </w:p>
     <w:p>
@@ -1262,17 +1262,17 @@
         <w:pStyle w:val="Heading2"/>
       </w:pPr>
       <w:r>
-        <w:t>文件与画像</w:t>
+        <w:t>Files and Persona</w:t>
       </w:r>
     </w:p>
     <w:p>
       <w:r>
-        <w:t>接受文本型 PDF/DOCX，建议限制 10 MB。上传后状态为 uploaded → parsing → needs_review → confirmed；failed 单独展示原因。解析只提供建议字段，教育、工作和技能保留来源片段及页面位置。用户修改后保存不可变 PersonaVersion，后续 AI 任务引用具体版本。扫描件未支持 OCR 时提供手动填写，不显示空白解析成功。</w:t>
+        <w:t>Accepts text-based PDF/DOCX, recommended limit 10 MB. After upload, status is uploaded → parsing → needs_review → confirmed; failed is shown with reasons. Parsing provides suggested fields, education, work, and skills retain source fragments and page positions. After user edits, save immutable PersonaVersion, which subsequent AI tasks reference by specific version. Manual entry is provided when OCR is not supported, without showing blank parsing success.</w:t>
       </w:r>
     </w:p>
     <w:p>
       <w:r>
-        <w:t>画像包括身份、学校/学位、经历/日期、技能、金融领域、职业目标、地区、目标机构/职级及联系意图。支持多个画像。文件内容不自动成为附件；第二期发信时用户另行勾选。</w:t>
+        <w:t>Persona includes identity, school/degree, experience/dates, skills, financial field, career goals, region, target organization/position, and contact intent. Supports multiple personas. File content does not automatically become an attachment; users select separately in Phase 2.</w:t>
       </w:r>
     </w:p>
     <w:p>
@@ -1280,17 +1280,17 @@
         <w:pStyle w:val="Heading2"/>
       </w:pPr>
       <w:r>
-        <w:t>搜索与补充</w:t>
+        <w:t>Search and Enrichment</w:t>
       </w:r>
     </w:p>
     <w:p>
       <w:r>
-        <w:t>Apollo 提供结构化人员搜索与按需邮箱补充；SerpAPI 通过 Google 检索 LinkedIn 公开档案，补充职业背景线索。Apollo 的姓名、机构或档案 URL 用于定位 LinkedIn；核对后的 LinkedIn 信息反向辅助 Apollo 匹配与补充。两路结果关联同一 Contact，分别保留来源、时间与冲突。搜索摘要只能标为待核实线索，不能自动认定同一人、覆盖字段或用于校友陈述。这是双源协同的目标设计：当前 MVP 仍使用通用 Google 查询，尚未实现 LinkedIn 定向检索、反向匹配及自动交叉核验。</w:t>
+        <w:t>Apollo provides structured people search and on-demand email enrichment; SerpAPI retrieves LinkedIn public profiles via Google, supplementing career background clues. Apollo's name, organization, or profile URL is used to locate LinkedIn; verified LinkedIn information assists Apollo matching and enrichment. Two sources are associated with the same Contact, separately retaining source, time, and conflicts. Search summary can only be marked as unverified clues, cannot automatically confirm the same person, overwrite fields, or be used for alumni statements. This is the target design for dual-source collaboration: current MVP still uses general Google queries, and has not yet implemented LinkedIn-targeted search, reverse matching, or automatic cross-verification.</w:t>
       </w:r>
     </w:p>
     <w:p>
       <w:r>
-        <w:t>搜索保存 SearchRun 的标准化条件、提供商及游标。每次补充和 AI 推荐限定结果数，失败逐条记录，不能把部分失败改成整体成功。搜索页支持保留筛选、翻页、打开详情、保存及直接写信。没有 Persona 时按基础相关性展示，不制造个性化匹配分数。</w:t>
+        <w:t>Search saves standardized SearchRun conditions, providers, and cursor. Each enrichment and AI recommendation limits result count; failures are recorded individually, cannot convert partial failures into overall success. Search page supports retaining filters, pagination, opening details, saving, and direct email writing. Without a Persona, show based on basic relevance, without creating personalized matching scores.</w:t>
       </w:r>
     </w:p>
     <w:p>
@@ -1298,17 +1298,17 @@
         <w:pStyle w:val="Heading2"/>
       </w:pPr>
       <w:r>
-        <w:t>来源和去重</w:t>
+        <w:t>Sources and Deduplication</w:t>
       </w:r>
     </w:p>
     <w:p>
       <w:r>
-        <w:t>事实存为 SourceEvidence：fact_id、字段、值、source_ref、获取时间、evidence_status 和 conflict_group。confirmed、inferred、unknown、conflict 是可解释的分类，不是模型随意生成的百分比置信度。优先使用提供商 ID、明确邮箱或公开档案标识去重；同名只提示候选，不能自动合并。</w:t>
+        <w:t>Facts are stored as SourceEvidence: fact_id, field, value, source_ref, retrieval time, evidence_status, and conflict_group. confirmed, inferred, unknown, and conflict are explainable categories, not model-generated percentage confidence levels. Prioritize deduplication using provider ID, clear email, or public profile identifier; same name only prompts candidates, cannot automatically merge.</w:t>
       </w:r>
     </w:p>
     <w:p>
       <w:r>
-        <w:t>邮箱缺失不阻止保存联系人和创建草稿。来源提供的 verified 状态与发信是否送达独立。联系人可具有多个领域资料；邮件历史归属于工作区与邮箱中的实际会话。</w:t>
+        <w:t>Missing email does not prevent saving contacts or creating drafts. Verified status from sources is independent of email delivery. Contacts can have multiple domain data; email history belongs to workspace and actual session in email.</w:t>
       </w:r>
     </w:p>
     <w:p>
@@ -1321,12 +1321,12 @@
         <w:pStyle w:val="Heading1"/>
       </w:pPr>
       <w:r>
-        <w:t>03 AI 写作工作台</w:t>
+        <w:t>03 AI Writing Workbench</w:t>
       </w:r>
     </w:p>
     <w:p>
       <w:r>
-        <w:t>Email Studio 使用“正文为主、证据在旁”的布局。用户必须能够从联系人详情直接打开编辑器，并看清当前收件人和所选画像。写作阶段不要求连接邮箱。</w:t>
+        <w:t>Email Studio uses a layout of 'body first, evidence beside'. Users must be able to open the editor directly from contact details and see the current recipient and selected persona. Email writing phase does not require connecting an email.</w:t>
       </w:r>
     </w:p>
     <w:tbl>
@@ -1374,7 +1374,7 @@
                 <w:color w:val="FFFFFF"/>
                 <w:sz w:val="18"/>
               </w:rPr>
-              <w:t>区块</w:t>
+              <w:t>Block</w:t>
             </w:r>
           </w:p>
         </w:tc>
@@ -1406,7 +1406,7 @@
                 <w:color w:val="FFFFFF"/>
                 <w:sz w:val="18"/>
               </w:rPr>
-              <w:t>内容</w:t>
+              <w:t>Content</w:t>
             </w:r>
           </w:p>
         </w:tc>
@@ -1438,7 +1438,7 @@
                 <w:color w:val="FFFFFF"/>
                 <w:sz w:val="18"/>
               </w:rPr>
-              <w:t>关键行为</w:t>
+              <w:t>Key actions</w:t>
             </w:r>
           </w:p>
         </w:tc>
@@ -1475,7 +1475,7 @@
                 <w:color w:val="000000"/>
                 <w:sz w:val="18"/>
               </w:rPr>
-              <w:t>写作 Brief</w:t>
+              <w:t>Writing Brief</w:t>
             </w:r>
           </w:p>
         </w:tc>
@@ -1507,7 +1507,7 @@
                 <w:color w:val="000000"/>
                 <w:sz w:val="18"/>
               </w:rPr>
-              <w:t>联系人、画像、目的、CTA、语气、长度、语言</w:t>
+              <w:t>Contact, persona, purpose, CTA, tone, length, language</w:t>
             </w:r>
           </w:p>
         </w:tc>
@@ -1539,7 +1539,7 @@
                 <w:color w:val="000000"/>
                 <w:sz w:val="18"/>
               </w:rPr>
-              <w:t>修改只影响下一次生成，不改已写正文</w:t>
+              <w:t>Modifications only affect the next generation, not the already written body</w:t>
             </w:r>
           </w:p>
         </w:tc>
@@ -1576,7 +1576,7 @@
                 <w:color w:val="000000"/>
                 <w:sz w:val="18"/>
               </w:rPr>
-              <w:t>编辑区</w:t>
+              <w:t>Edit area</w:t>
             </w:r>
           </w:p>
         </w:tc>
@@ -1608,7 +1608,7 @@
                 <w:color w:val="000000"/>
                 <w:sz w:val="18"/>
               </w:rPr>
-              <w:t>主题、富文本、变量、字数、保存状态</w:t>
+              <w:t>Subject, rich text, variables, word count, save status</w:t>
             </w:r>
           </w:p>
         </w:tc>
@@ -1640,7 +1640,7 @@
                 <w:color w:val="000000"/>
                 <w:sz w:val="18"/>
               </w:rPr>
-              <w:t>手动输入优先；主题与正文共同保存</w:t>
+              <w:t>Manual input prioritized; subject and body are saved together</w:t>
             </w:r>
           </w:p>
         </w:tc>
@@ -1677,7 +1677,7 @@
                 <w:color w:val="000000"/>
                 <w:sz w:val="18"/>
               </w:rPr>
-              <w:t>证据区</w:t>
+              <w:t>Evidence area</w:t>
             </w:r>
           </w:p>
         </w:tc>
@@ -1709,7 +1709,7 @@
                 <w:color w:val="000000"/>
                 <w:sz w:val="18"/>
               </w:rPr>
-              <w:t>联系人事实、用户背景、来源、待确认项</w:t>
+              <w:t>Contact facts, user background, sources, pending confirmation items</w:t>
             </w:r>
           </w:p>
         </w:tc>
@@ -1741,7 +1741,7 @@
                 <w:color w:val="000000"/>
                 <w:sz w:val="18"/>
               </w:rPr>
-              <w:t>可勾选允许 AI 使用的事实，取消后不用于生成</w:t>
+              <w:t>Checkable facts allowed for AI use; canceling removes them from generation</w:t>
             </w:r>
           </w:p>
         </w:tc>
@@ -1778,7 +1778,7 @@
                 <w:color w:val="000000"/>
                 <w:sz w:val="18"/>
               </w:rPr>
-              <w:t>AI 建议区</w:t>
+              <w:t>AI suggestion area</w:t>
             </w:r>
           </w:p>
         </w:tc>
@@ -1810,7 +1810,7 @@
                 <w:color w:val="000000"/>
                 <w:sz w:val="18"/>
               </w:rPr>
-              <w:t>候选主题/正文、变更和警告</w:t>
+              <w:t>Candidate subject/body, changes, and warnings</w:t>
             </w:r>
           </w:p>
         </w:tc>
@@ -1842,7 +1842,7 @@
                 <w:color w:val="000000"/>
                 <w:sz w:val="18"/>
               </w:rPr>
-              <w:t>生成结果先在这里；提供采纳、丢弃及重新生成</w:t>
+              <w:t>Generated results appear here; provide options to adopt, discard, or regenerate</w:t>
             </w:r>
           </w:p>
         </w:tc>
@@ -1879,7 +1879,7 @@
                 <w:color w:val="000000"/>
                 <w:sz w:val="18"/>
               </w:rPr>
-              <w:t>预览区</w:t>
+              <w:t>Preview area</w:t>
             </w:r>
           </w:p>
         </w:tc>
@@ -1911,7 +1911,7 @@
                 <w:color w:val="000000"/>
                 <w:sz w:val="18"/>
               </w:rPr>
-              <w:t>真实变量值、缺失项、最终纯文本/HTML</w:t>
+              <w:t>Real variable values, missing items, final plain text/HTML</w:t>
             </w:r>
           </w:p>
         </w:tc>
@@ -1943,7 +1943,7 @@
                 <w:color w:val="000000"/>
                 <w:sz w:val="18"/>
               </w:rPr>
-              <w:t>对应特定联系人；Ready 只是草稿通过本地检查</w:t>
+              <w:t>Corresponds to specific contacts; Ready only means draft passed local checks</w:t>
             </w:r>
           </w:p>
         </w:tc>
@@ -1955,12 +1955,12 @@
         <w:pStyle w:val="Heading2"/>
       </w:pPr>
       <w:r>
-        <w:t>写作意图</w:t>
+        <w:t>Writing Intent</w:t>
       </w:r>
     </w:p>
     <w:p>
       <w:r>
-        <w:t>默认目的为 Networking；另外提供 Informational Interview 和 Recruiting。CTA 默认请求一次简短交流，用户可编辑。英文默认 90–140 words 属于建议范围，不是阻断阈值；中文用字符数提示，不能用空格分词制造“中文单词数”。首版保留少量写作起点，完整模板 CRUD 在第四期。</w:t>
+        <w:t>Default purpose is Networking; also provides Informational Interview and Recruiting. CTA defaults to a brief conversation request, which users can edit. English default word count is 90–140, which is a recommendation range, not a blocking threshold; for Chinese, character count is used, and spaces cannot be used to create 'words'. The first version retains a small amount of writing starting points, and the full CRUD template will be available in phase four.</w:t>
       </w:r>
     </w:p>
     <w:p>
@@ -1968,12 +1968,12 @@
         <w:pStyle w:val="Heading2"/>
       </w:pPr>
       <w:r>
-        <w:t>交互主线</w:t>
+        <w:t>Interaction flow</w:t>
       </w:r>
     </w:p>
     <w:p>
       <w:r>
-        <w:t>选择联系人与画像 → 检查证据 → 设置 Brief → Generate suggestion → 查看候选及警告 → Apply 或 Discard → 手动编辑 → Preview → Save/Copy。界面允许跳过 AI，直接写作。后续 Gmail 按钮在一期为明确的 Coming in phase 2，不能产生假的发送事件。</w:t>
+        <w:t>Select contact and persona → Check evidence → Set Brief → Generate suggestion → View candidates and warnings → Apply or Discard → Manual edit → Preview → Save/Copy. The interface allows skipping AI and writing directly. The Gmail button in the next phase is explicitly marked as 'Coming in phase 2', and cannot generate fake send events.</w:t>
       </w:r>
     </w:p>
     <w:p>
@@ -1981,12 +1981,12 @@
         <w:pStyle w:val="Heading2"/>
       </w:pPr>
       <w:r>
-        <w:t>空状态与异常</w:t>
+        <w:t>Empty state and exceptions</w:t>
       </w:r>
     </w:p>
     <w:p>
       <w:r>
-        <w:t>没有收件人可以先写通用稿；没有画像可以手写，生成个性化内容时提示背景不足。API 超时保留当前稿并允许重试。用户取消生成后，迟到结果不再自动应用；当前编辑不因跳页或失焦丢失。</w:t>
+        <w:t>If there is no recipient, users can first write a general draft; if there is no persona, they can write manually, and a prompt is shown when generating personalized content due to insufficient background. API timeouts retain the current draft and allow retries. If users cancel generation, late results are not automatically applied; current edits are not lost due to page navigation or focus loss.</w:t>
       </w:r>
     </w:p>
     <w:p>
@@ -1999,7 +1999,7 @@
         <w:pStyle w:val="Heading1"/>
       </w:pPr>
       <w:r>
-        <w:t>04 证据驱动的个性化</w:t>
+        <w:t>04 Evidence-driven personalization</w:t>
       </w:r>
     </w:p>
     <w:p>
@@ -2007,12 +2007,12 @@
         <w:pStyle w:val="Heading2"/>
       </w:pPr>
       <w:r>
-        <w:t>什么内容允许写进邮件</w:t>
+        <w:t>What content is allowed to be written in the email</w:t>
       </w:r>
     </w:p>
     <w:p>
       <w:r>
-        <w:t>模型只能使用当前任务中明确允许的事实。联系人公司与职位、用户经历来自不同证据记录；共同点必须有双方证据支撑。学校未知时不写“我们是校友”；公开资料有冲突时，用户先校对或改用没有冲突的联系理由。用户自由输入的事实可以保存为 user_confirmed，但不能标为外部验证。</w:t>
+        <w:t>The model can only use facts explicitly allowed in the current task. Contact company and position, and user experience come from different evidence records; common points must be supported by evidence from both sides. If school is unknown, do not write 'we are alumni'; if there is a conflict in public-profile evidence, users must first review or use a contact reason without conflict. Facts freely input by users can be saved as user_confirmed, but cannot be marked as externally verified.</w:t>
       </w:r>
     </w:p>
     <w:tbl>
@@ -2060,7 +2060,7 @@
                 <w:color w:val="FFFFFF"/>
                 <w:sz w:val="18"/>
               </w:rPr>
-              <w:t>事实状态</w:t>
+              <w:t>Fact status</w:t>
             </w:r>
           </w:p>
         </w:tc>
@@ -2092,7 +2092,7 @@
                 <w:color w:val="FFFFFF"/>
                 <w:sz w:val="18"/>
               </w:rPr>
-              <w:t>默认生成策略</w:t>
+              <w:t>Default generation strategy</w:t>
             </w:r>
           </w:p>
         </w:tc>
@@ -2124,7 +2124,7 @@
                 <w:color w:val="FFFFFF"/>
                 <w:sz w:val="18"/>
               </w:rPr>
-              <w:t>界面动作</w:t>
+              <w:t>Interface actions</w:t>
             </w:r>
           </w:p>
         </w:tc>
@@ -2193,7 +2193,7 @@
                 <w:color w:val="000000"/>
                 <w:sz w:val="18"/>
               </w:rPr>
-              <w:t>允许；保留 fact_id 与来源</w:t>
+              <w:t>Allowed; retain fact_id and source</w:t>
             </w:r>
           </w:p>
         </w:tc>
@@ -2225,7 +2225,7 @@
                 <w:color w:val="000000"/>
                 <w:sz w:val="18"/>
               </w:rPr>
-              <w:t>查看来源，取消使用</w:t>
+              <w:t>View source, cancel use</w:t>
             </w:r>
           </w:p>
         </w:tc>
@@ -2294,7 +2294,7 @@
                 <w:color w:val="000000"/>
                 <w:sz w:val="18"/>
               </w:rPr>
-              <w:t>允许；说明来自用户确认</w:t>
+              <w:t>Allowed; explanation from user confirmation</w:t>
             </w:r>
           </w:p>
         </w:tc>
@@ -2326,7 +2326,7 @@
                 <w:color w:val="000000"/>
                 <w:sz w:val="18"/>
               </w:rPr>
-              <w:t>编辑并记录确认时间</w:t>
+              <w:t>Edit and record confirmation time</w:t>
             </w:r>
           </w:p>
         </w:tc>
@@ -2395,7 +2395,7 @@
                 <w:color w:val="000000"/>
                 <w:sz w:val="18"/>
               </w:rPr>
-              <w:t>不写成确定陈述</w:t>
+              <w:t>Not written as a definite statement</w:t>
             </w:r>
           </w:p>
         </w:tc>
@@ -2427,7 +2427,7 @@
                 <w:color w:val="000000"/>
                 <w:sz w:val="18"/>
               </w:rPr>
-              <w:t>提示补证据或换联系理由</w:t>
+              <w:t>Prompt for evidence or reason to change contact</w:t>
             </w:r>
           </w:p>
         </w:tc>
@@ -2496,7 +2496,7 @@
                 <w:color w:val="000000"/>
                 <w:sz w:val="18"/>
               </w:rPr>
-              <w:t>不使用</w:t>
+              <w:t>Not use</w:t>
             </w:r>
           </w:p>
         </w:tc>
@@ -2528,7 +2528,7 @@
                 <w:color w:val="000000"/>
                 <w:sz w:val="18"/>
               </w:rPr>
-              <w:t>补齐、设置默认值或省略</w:t>
+              <w:t>Fill in, set default, or omit</w:t>
             </w:r>
           </w:p>
         </w:tc>
@@ -2597,7 +2597,7 @@
                 <w:color w:val="000000"/>
                 <w:sz w:val="18"/>
               </w:rPr>
-              <w:t>暂停使用该项</w:t>
+              <w:t>Pause using this item</w:t>
             </w:r>
           </w:p>
         </w:tc>
@@ -2629,7 +2629,7 @@
                 <w:color w:val="000000"/>
                 <w:sz w:val="18"/>
               </w:rPr>
-              <w:t>显示冲突值，让用户确认</w:t>
+              <w:t>Display conflicting values, let user confirm</w:t>
             </w:r>
           </w:p>
         </w:tc>
@@ -2641,12 +2641,12 @@
         <w:pStyle w:val="Heading2"/>
       </w:pPr>
       <w:r>
-        <w:t>推荐理由与邮件陈述</w:t>
+        <w:t>Recommendation rationale and email statements</w:t>
       </w:r>
     </w:p>
     <w:p>
       <w:r>
-        <w:t>推荐理由可以表达“对方领域与目标相关”；邮件里涉及“你最近完成某笔交易”等具体陈述必须有相应证据。匹配分数如后续增加，含义只能是相对匹配，不是回复概率，也不替代事实来源。</w:t>
+        <w:t>Recommendation rationale can express that 'the other party's field is relevant to the target'; statements in the email involving 'you recently completed a transaction' must have corresponding evidence. If matching scores are added later, their meaning can only be relative matching, not a reply probability, and they cannot replace the source of facts.</w:t>
       </w:r>
     </w:p>
     <w:p>
@@ -2654,12 +2654,12 @@
         <w:pStyle w:val="Heading2"/>
       </w:pPr>
       <w:r>
-        <w:t>引用展示</w:t>
+        <w:t>Citation display</w:t>
       </w:r>
     </w:p>
     <w:p>
       <w:r>
-        <w:t>产品侧显示每个事实的来源标签，用户可以展开。发给联系人的正文默认不插入内部 fact_id 或技术标记。发送版本中的事实映射保存在 GenerationRun/DraftRevision，方便解释或核对，不把内部备注或未选简历段落放进邮件。</w:t>
+        <w:t>The product side displays a source tag for each fact, and users can expand it. The body of the email sent to contacts defaults to not inserting internal fact_id or technical tags. The fact mapping in the sent version is saved in GenerationRun/DraftRevision, which facilitates explanation or verification, and internal notes or unselected resume segments are not included in the email.</w:t>
       </w:r>
     </w:p>
     <w:p>
@@ -2667,12 +2667,12 @@
         <w:pStyle w:val="Heading2"/>
       </w:pPr>
       <w:r>
-        <w:t>输入安全边界</w:t>
+        <w:t>Input safety boundaries</w:t>
       </w:r>
     </w:p>
     <w:p>
       <w:r>
-        <w:t>简历、网页和收到的邮件都作为数据传给模型。生成服务不持有发信工具权限；其输出只能成为候选内容。schema 校验和允许事实集合能减少错误，但不能证明模型完全没有幻觉，最终仍需要用户审阅。</w:t>
+        <w:t>Resumes, web pages, and received emails are all data passed to the model. The generation service does not have the authority to send emails; its output can only be candidate content. Schema validation and allowed fact sets can reduce errors, but cannot prove the model has no hallucinations. Final review is still required by users.</w:t>
       </w:r>
     </w:p>
     <w:p>
@@ -2685,7 +2685,7 @@
         <w:pStyle w:val="Heading1"/>
       </w:pPr>
       <w:r>
-        <w:t>05 改写采纳与版本控制</w:t>
+        <w:t>05 Rewriting adoption and version control</w:t>
       </w:r>
     </w:p>
     <w:p>
@@ -2693,12 +2693,12 @@
         <w:pStyle w:val="Heading2"/>
       </w:pPr>
       <w:r>
-        <w:t>避免覆盖用户编辑</w:t>
+        <w:t>Avoid overwriting user edits</w:t>
       </w:r>
     </w:p>
     <w:p>
       <w:r>
-        <w:t>每次生成提交 base_revision，候选返回 generation_id。用户可在等待期间继续写作。若当前 revision 已不同，界面将候选标记为 Outdated suggestion，保留候选可读，但禁用直接替换；用户可重新生成或手动复制局部内容。取消和过期任务不能自动改变正文。</w:t>
+        <w:t>Each generation submission includes base_revision, and the candidate returns generation_id. Users can continue writing during the waiting period. If the current revision is different, the candidate is marked as Outdated suggestion, the candidate remains readable, but direct replacement is disabled; users can regenerate or manually copy partial content. Cancelled and expired tasks cannot automatically change the body.</w:t>
       </w:r>
     </w:p>
     <w:p>
@@ -2706,12 +2706,12 @@
         <w:pStyle w:val="Heading2"/>
       </w:pPr>
       <w:r>
-        <w:t>全文建议与局部改写</w:t>
+        <w:t>Full suggestion and partial rewriting</w:t>
       </w:r>
     </w:p>
     <w:p>
       <w:r>
-        <w:t>全文生成显示当前稿和建议稿。首版至少清楚展示两份内容，支持 Apply、Discard 和 Undo；可以随后优化为段落差异高亮。局部改写要求明确选区，将选区文本、范围及 revision 一同提交。缩短和语气调整不允许添加新事实，无选区时提示选择，不静默重写全文。</w:t>
+        <w:t>Full generation displays the current draft and the suggested draft. The first version at least clearly shows two versions of content, supporting Apply, Discard, and Undo; it can later be optimized to highlight paragraph differences. Partial rewriting requires a clear selection, submitting the selected text, range, and revision together. Shortening and tone adjustments are not allowed to add new facts; if no selection is made, prompt the user to select, and do not silently rewrite the entire draft.</w:t>
       </w:r>
     </w:p>
     <w:tbl>
@@ -2759,7 +2759,7 @@
                 <w:color w:val="FFFFFF"/>
                 <w:sz w:val="18"/>
               </w:rPr>
-              <w:t>操作</w:t>
+              <w:t>Action</w:t>
             </w:r>
           </w:p>
         </w:tc>
@@ -2791,7 +2791,7 @@
                 <w:color w:val="FFFFFF"/>
                 <w:sz w:val="18"/>
               </w:rPr>
-              <w:t>保存内容</w:t>
+              <w:t>Save content</w:t>
             </w:r>
           </w:p>
         </w:tc>
@@ -2823,7 +2823,7 @@
                 <w:color w:val="FFFFFF"/>
                 <w:sz w:val="18"/>
               </w:rPr>
-              <w:t>对当前稿的影响</w:t>
+              <w:t>Impact on current draft</w:t>
             </w:r>
           </w:p>
         </w:tc>
@@ -2892,7 +2892,7 @@
                 <w:color w:val="000000"/>
                 <w:sz w:val="18"/>
               </w:rPr>
-              <w:t>候选、输入快照、警告</w:t>
+              <w:t>Candidate, input snapshot, warning</w:t>
             </w:r>
           </w:p>
         </w:tc>
@@ -2924,7 +2924,7 @@
                 <w:color w:val="000000"/>
                 <w:sz w:val="18"/>
               </w:rPr>
-              <w:t>无自动修改</w:t>
+              <w:t>No automatic modification</w:t>
             </w:r>
           </w:p>
         </w:tc>
@@ -2993,7 +2993,7 @@
                 <w:color w:val="000000"/>
                 <w:sz w:val="18"/>
               </w:rPr>
-              <w:t>新 DraftRevision 和来源映射</w:t>
+              <w:t>New DraftRevision and source mapping</w:t>
             </w:r>
           </w:p>
         </w:tc>
@@ -3025,7 +3025,7 @@
                 <w:color w:val="000000"/>
                 <w:sz w:val="18"/>
               </w:rPr>
-              <w:t>明确替换选定内容</w:t>
+              <w:t>Explicitly replace selected content</w:t>
             </w:r>
           </w:p>
         </w:tc>
@@ -3094,7 +3094,7 @@
                 <w:color w:val="000000"/>
                 <w:sz w:val="18"/>
               </w:rPr>
-              <w:t>候选丢弃状态</w:t>
+              <w:t>Candidate discard status</w:t>
             </w:r>
           </w:p>
         </w:tc>
@@ -3126,7 +3126,7 @@
                 <w:color w:val="000000"/>
                 <w:sz w:val="18"/>
               </w:rPr>
-              <w:t>保持不变</w:t>
+              <w:t>Stay the same</w:t>
             </w:r>
           </w:p>
         </w:tc>
@@ -3195,7 +3195,7 @@
                 <w:color w:val="000000"/>
                 <w:sz w:val="18"/>
               </w:rPr>
-              <w:t>恢复前一版本为新 revision</w:t>
+              <w:t>Restore previous version as new revision</w:t>
             </w:r>
           </w:p>
         </w:tc>
@@ -3227,7 +3227,7 @@
                 <w:color w:val="000000"/>
                 <w:sz w:val="18"/>
               </w:rPr>
-              <w:t>不删除历史</w:t>
+              <w:t>Do not delete history</w:t>
             </w:r>
           </w:p>
         </w:tc>
@@ -3296,7 +3296,7 @@
                 <w:color w:val="000000"/>
                 <w:sz w:val="18"/>
               </w:rPr>
-              <w:t>新正文及 revision</w:t>
+              <w:t>New body and revision</w:t>
             </w:r>
           </w:p>
         </w:tc>
@@ -3328,7 +3328,7 @@
                 <w:color w:val="000000"/>
                 <w:sz w:val="18"/>
               </w:rPr>
-              <w:t>标记已改变的证据关联待复核</w:t>
+              <w:t>Mark changed evidence associations for review</w:t>
             </w:r>
           </w:p>
         </w:tc>
@@ -3340,12 +3340,12 @@
         <w:pStyle w:val="Heading2"/>
       </w:pPr>
       <w:r>
-        <w:t>自动保存</w:t>
+        <w:t>Auto-save</w:t>
       </w:r>
     </w:p>
     <w:p>
       <w:r>
-        <w:t>建议输入停止后约一秒防抖保存，界面显示 Saving、Saved、Unsaved 或 Conflict。PATCH 使用 expected_revision；409 时保留服务器版和本地版，用户选择或合并，不进行 last-write-wins 静默覆盖。离线可保留临时本地稿，重新连接后显式恢复；生产数据仍以服务器保存为准。</w:t>
+        <w:t>Save approximately one second after stopping input, with the interface showing Saving, Saved, Unsaved, or Conflict. PATCH uses expected_revision; on 409, retain the server version and local version, allowing users to choose or merge, without silent override via last-write-wins. Offline drafts can be temporarily saved locally, and explicitly restored upon reconnection; production data still uses server storage as the standard.</w:t>
       </w:r>
     </w:p>
     <w:p>
@@ -3353,12 +3353,12 @@
         <w:pStyle w:val="Heading2"/>
       </w:pPr>
       <w:r>
-        <w:t>语言与长度</w:t>
+        <w:t>Language and length</w:t>
       </w:r>
     </w:p>
     <w:p>
       <w:r>
-        <w:t>Translate 与 Rewrite 应是不同操作：界面语言切换不翻译正文。改写沿用邮件语言，切换生成语言只影响新建议。长度超出目标显示建议，不丢弃重要事实；变量缺失属于阻断项，超字数属于非阻断提醒。</w:t>
+        <w:t>Translate and Rewrite should be different operations: interface language switching does not translate the body. Rewriting continues using the email language, and switching the generation language only affects new suggestions. If length exceeds the target, show a suggestion, but do not discard important facts; missing variables are blocking items, while exceeding word count is a non-blocking reminder.</w:t>
       </w:r>
     </w:p>
     <w:p>
@@ -3371,7 +3371,7 @@
         <w:pStyle w:val="Heading1"/>
       </w:pPr>
       <w:r>
-        <w:t>06 变量预览与 AI 输出契约</w:t>
+        <w:t>06 Variable preview and AI output covenant</w:t>
       </w:r>
     </w:p>
     <w:p>
@@ -3379,17 +3379,17 @@
         <w:pStyle w:val="Heading2"/>
       </w:pPr>
       <w:r>
-        <w:t>变量模型</w:t>
+        <w:t>Variable model</w:t>
       </w:r>
     </w:p>
     <w:p>
       <w:r>
-        <w:t>变量使用结构化编辑器节点，存 name、label、required 和可选 fallback。界面可参考 Tiptap 的节点交互方式［S06］，业务变量校验须自行实现。原始 editor_json 为编辑来源；最终 HTML 和 plain_text 由同一渲染器产生，不能分别用两套替换逻辑。</w:t>
+        <w:t>Variables use a structured editor node, storing name, label, required, and optional fallback. The interface can reference Tiptap's node interaction method [S06], and business variable validation must be implemented separately. The original editor_json is the source of editing; the final HTML and plain_text are generated by the same renderer, and cannot use two separate replacement logics.</w:t>
       </w:r>
     </w:p>
     <w:p>
       <w:r>
-        <w:t>first_name、company、title、school、sender_name 及 custom.* 在统一字段注册表定义。未知字段直接报错；必填空值列入 missing_variables。用户明确设置的 fallback 可以参与预览，不能将 unknown 转为看似真实的学校或机构。复制前使用最终预览，原模板仍保留变量节点。</w:t>
+        <w:t>first_name, company, title, school, sender_name, and custom.* are defined in a unified field registry. Unknown fields result in errors; empty required fields are listed as missing_variables. Fallbacks explicitly set by users can participate in previews, but unknowns cannot be converted into seemingly real schools or institutions. Use the final preview before copying; the original template still retains variable nodes.</w:t>
       </w:r>
     </w:p>
     <w:p>
@@ -3397,7 +3397,7 @@
         <w:pStyle w:val="Heading2"/>
       </w:pPr>
       <w:r>
-        <w:t>生成输入与输出</w:t>
+        <w:t>Generation input and output</w:t>
       </w:r>
     </w:p>
     <w:tbl>
@@ -3445,7 +3445,7 @@
                 <w:color w:val="FFFFFF"/>
                 <w:sz w:val="18"/>
               </w:rPr>
-              <w:t>结构</w:t>
+              <w:t>Structure</w:t>
             </w:r>
           </w:p>
         </w:tc>
@@ -3477,7 +3477,7 @@
                 <w:color w:val="FFFFFF"/>
                 <w:sz w:val="18"/>
               </w:rPr>
-              <w:t>关键字段</w:t>
+              <w:t>Key fields</w:t>
             </w:r>
           </w:p>
         </w:tc>
@@ -3509,7 +3509,7 @@
                 <w:color w:val="FFFFFF"/>
                 <w:sz w:val="18"/>
               </w:rPr>
-              <w:t>约束</w:t>
+              <w:t>Constraints</w:t>
             </w:r>
           </w:p>
         </w:tc>
@@ -3610,7 +3610,7 @@
                 <w:color w:val="000000"/>
                 <w:sz w:val="18"/>
               </w:rPr>
-              <w:t>用户意图，不自动执行外部操作</w:t>
+              <w:t>User intent, no automatic execution of external operations</w:t>
             </w:r>
           </w:p>
         </w:tc>
@@ -3711,7 +3711,7 @@
                 <w:color w:val="000000"/>
                 <w:sz w:val="18"/>
               </w:rPr>
-              <w:t>服务端读取并限定当前工作区</w:t>
+              <w:t>Server reads and limits to current workspace</w:t>
             </w:r>
           </w:p>
         </w:tc>
@@ -3812,7 +3812,7 @@
                 <w:color w:val="000000"/>
                 <w:sz w:val="18"/>
               </w:rPr>
-              <w:t>校验 schema；非法字段不写入正文</w:t>
+              <w:t>Validate schema; illegal fields not written to body</w:t>
             </w:r>
           </w:p>
         </w:tc>
@@ -3913,7 +3913,7 @@
                 <w:color w:val="000000"/>
                 <w:sz w:val="18"/>
               </w:rPr>
-              <w:t>引用必须在允许集合；无来源陈述警告</w:t>
+              <w:t>References must be in allowed set; no source statement warning</w:t>
             </w:r>
           </w:p>
         </w:tc>
@@ -4014,7 +4014,7 @@
                 <w:color w:val="000000"/>
                 <w:sz w:val="18"/>
               </w:rPr>
-              <w:t>确定性渲染；Ready与邮件送达无关</w:t>
+              <w:t>Deterministic rendering; Ready is unrelated to email delivery</w:t>
             </w:r>
           </w:p>
         </w:tc>
@@ -4026,17 +4026,17 @@
         <w:pStyle w:val="Heading2"/>
       </w:pPr>
       <w:r>
-        <w:t>失败及重试</w:t>
+        <w:t>Failures and retries</w:t>
       </w:r>
     </w:p>
     <w:p>
       <w:r>
-        <w:t>格式错误可进行一次有界修复；仍失败则返回结构化错误，原稿保持不变。429 提示限流并采用有界退避；没有凭据显示 Unconfigured。写作请求可重试但须有 request_id 关联，避免用户重复点击产生不可辨认的候选。日志记录模型、版本、耗时、状态和用量，不默认记录完整简历、邮件正文或密钥。</w:t>
+        <w:t>Format errors can be fixed once with bounded repair; if still failed, return structured errors, and the original draft remains unchanged. 429 prompts rate limiting and uses bounded backoff; no credentials show Unconfigured. Writing requests can be retried but must be associated with request_id to avoid users generating indistinguishable candidates by repeated clicks. Logs record model, version, duration, status, and usage, without defaulting to recording full resumes, email bodies, or keys.</w:t>
       </w:r>
     </w:p>
     <w:p>
       <w:r>
-        <w:t>一期允许 HTTP 等待式生成并显示取消/加载状态；若引入流式建议，未完成内容不可采纳。无需为一期搭建通用队列系统。</w:t>
+        <w:t>Phase one allows HTTP wait-style generation and displays cancel/loading status; if streaming suggestions are introduced, incomplete content cannot be adopted. No need to build a general-purpose queue system for phase one.</w:t>
       </w:r>
     </w:p>
     <w:p>
@@ -4049,12 +4049,12 @@
         <w:pStyle w:val="Heading1"/>
       </w:pPr>
       <w:r>
-        <w:t>07 AI 示例与验收样本</w:t>
+        <w:t>07 AI examples and acceptance samples</w:t>
       </w:r>
     </w:p>
     <w:p>
       <w:r>
-        <w:t>以下人名、机构、简历和联系资料均为虚构，用于说明产品行为，不对应真实搜索结果。HTML 演示使用同一组示例。</w:t>
+        <w:t>The following names, organizations, resumes, and contact information are all fictional and used for product behavior demonstration, not corresponding to real search results. HTML demos use the same set of examples.</w:t>
       </w:r>
     </w:p>
     <w:p>
@@ -4062,12 +4062,12 @@
         <w:pStyle w:val="Heading2"/>
       </w:pPr>
       <w:r>
-        <w:t>可用事实</w:t>
+        <w:t>Available facts</w:t>
       </w:r>
     </w:p>
     <w:p>
       <w:r>
-        <w:t>用户 Alex Chen：MSc Finance；在虚构 Northbridge Advisory 完成估值研究实习；目标为伦敦 Healthcare Investment Banking。联系人 Maya Patel：虚构 Harborstone Capital 的 Healthcare Investment Banking Associate；地区为 London；学校未知。允许事实仅包含上述已确认字段。</w:t>
+        <w:t>User Alex Chen: MSc Finance; completed valuation research internship at fictional Northbridge Advisory; target is London Healthcare Investment Banking. Contact Maya Patel: Healthcare Investment Banking Associate at fictional Harborstone Capital; location is London; school unknown. Only facts from the above confirmed fields are allowed.</w:t>
       </w:r>
     </w:p>
     <w:p>
@@ -4075,7 +4075,7 @@
         <w:pStyle w:val="Heading2"/>
       </w:pPr>
       <w:r>
-        <w:t>可接受的邮件示例</w:t>
+        <w:t>Acceptable Email Example</w:t>
       </w:r>
     </w:p>
     <w:p>
@@ -4104,12 +4104,12 @@
         <w:pStyle w:val="Heading2"/>
       </w:pPr>
       <w:r>
-        <w:t>必须避免的内容</w:t>
+        <w:t>Must Avoid Content</w:t>
       </w:r>
     </w:p>
     <w:p>
       <w:r>
-        <w:t>“As a fellow alumnus”没有双方学校证据；“I loved your recent deal”没有交易来源；“I was referred by our mutual contact”没有共同联系人的授权事实。这些内容不能因为听起来个性化就被接受。用户要求添加时，提示补充证据或改成领域相关的联系理由。</w:t>
+        <w:t>‘As a fellow alumnus’ lacks evidence of both schools; ‘I loved your recent deal’ lacks transaction source; ‘I was referred by our mutual contact’ lacks authorized fact of a common contact. Such content cannot be accepted merely because it sounds personalized. When users request to add such content, prompt for evidence or change to a contact reason relevant to the field.</w:t>
       </w:r>
     </w:p>
     <w:p>
@@ -4117,7 +4117,7 @@
         <w:pStyle w:val="Heading2"/>
       </w:pPr>
       <w:r>
-        <w:t>评估准则</w:t>
+        <w:t>Evaluation Criteria</w:t>
       </w:r>
     </w:p>
     <w:tbl>
@@ -4164,7 +4164,7 @@
                 <w:color w:val="FFFFFF"/>
                 <w:sz w:val="18"/>
               </w:rPr>
-              <w:t>样本</w:t>
+              <w:t>Sample</w:t>
             </w:r>
           </w:p>
         </w:tc>
@@ -4196,7 +4196,7 @@
                 <w:color w:val="FFFFFF"/>
                 <w:sz w:val="18"/>
               </w:rPr>
-              <w:t>预期结果</w:t>
+              <w:t>Expected result</w:t>
             </w:r>
           </w:p>
         </w:tc>
@@ -4233,7 +4233,7 @@
                 <w:color w:val="000000"/>
                 <w:sz w:val="18"/>
               </w:rPr>
-              <w:t>缺少学校</w:t>
+              <w:t>Missing school</w:t>
             </w:r>
           </w:p>
         </w:tc>
@@ -4265,7 +4265,7 @@
                 <w:color w:val="000000"/>
                 <w:sz w:val="18"/>
               </w:rPr>
-              <w:t>仍可写信，不编造校友</w:t>
+              <w:t>Still can write letter, no fabrication of alumni</w:t>
             </w:r>
           </w:p>
         </w:tc>
@@ -4302,7 +4302,7 @@
                 <w:color w:val="000000"/>
                 <w:sz w:val="18"/>
               </w:rPr>
-              <w:t>用户要求加无来源交易</w:t>
+              <w:t>User requests to add unverified transaction</w:t>
             </w:r>
           </w:p>
         </w:tc>
@@ -4334,7 +4334,7 @@
                 <w:color w:val="000000"/>
                 <w:sz w:val="18"/>
               </w:rPr>
-              <w:t>警告并选择有依据的替代句</w:t>
+              <w:t>Warn and choose an alternative sentence with basis</w:t>
             </w:r>
           </w:p>
         </w:tc>
@@ -4371,7 +4371,7 @@
                 <w:color w:val="000000"/>
                 <w:sz w:val="18"/>
               </w:rPr>
-              <w:t>生成期间正文变化</w:t>
+              <w:t>Body changes during generation</w:t>
             </w:r>
           </w:p>
         </w:tc>
@@ -4403,7 +4403,7 @@
                 <w:color w:val="000000"/>
                 <w:sz w:val="18"/>
               </w:rPr>
-              <w:t>候选过期，不覆盖</w:t>
+              <w:t>Candidate expired, not overwrite</w:t>
             </w:r>
           </w:p>
         </w:tc>
@@ -4440,7 +4440,7 @@
                 <w:color w:val="000000"/>
                 <w:sz w:val="18"/>
               </w:rPr>
-              <w:t>模型返回假 fact_id</w:t>
+              <w:t>Model returns fake fact_id</w:t>
             </w:r>
           </w:p>
         </w:tc>
@@ -4472,7 +4472,7 @@
                 <w:color w:val="000000"/>
                 <w:sz w:val="18"/>
               </w:rPr>
-              <w:t>校验失败或移除候选陈述，交给用户审阅</w:t>
+              <w:t>Validation failure or remove candidate statement, hand over to user review</w:t>
             </w:r>
           </w:p>
         </w:tc>
@@ -4509,7 +4509,7 @@
                 <w:color w:val="000000"/>
                 <w:sz w:val="18"/>
               </w:rPr>
-              <w:t>用户没有简历</w:t>
+              <w:t>User has no resume</w:t>
             </w:r>
           </w:p>
         </w:tc>
@@ -4541,7 +4541,7 @@
                 <w:color w:val="000000"/>
                 <w:sz w:val="18"/>
               </w:rPr>
-              <w:t>可手写；个性化生成提示补充背景</w:t>
+              <w:t>Can handwrite; personalized generation prompt supplements background</w:t>
             </w:r>
           </w:p>
         </w:tc>
@@ -4558,12 +4558,12 @@
         <w:pStyle w:val="Heading1"/>
       </w:pPr>
       <w:r>
-        <w:t>08 数据关系与生命周期</w:t>
+        <w:t>08 Data Relationships and Lifecycle</w:t>
       </w:r>
     </w:p>
     <w:p>
       <w:r>
-        <w:t>服务端始终以 Workspace 为访问范围。第一期是仅本地的固定工作区，第二期引入实际用户及 Membership；不能到邮箱接入后才补数据归属。多个真实邮箱归于同一个人工作区，团队角色仅预留。</w:t>
+        <w:t>The server always operates within the scope of a Workspace. The first phase is a local fixed workspace only, the second phase introduces real users and Membership; data ownership cannot be added after email integration. Multiple real emails belong to the same person's workspace, and team roles are only reserved.</w:t>
       </w:r>
     </w:p>
     <w:tbl>
@@ -4611,7 +4611,7 @@
                 <w:color w:val="FFFFFF"/>
                 <w:sz w:val="18"/>
               </w:rPr>
-              <w:t>实体组</w:t>
+              <w:t>Entity group</w:t>
             </w:r>
           </w:p>
         </w:tc>
@@ -4643,7 +4643,7 @@
                 <w:color w:val="FFFFFF"/>
                 <w:sz w:val="18"/>
               </w:rPr>
-              <w:t>主要关系</w:t>
+              <w:t>Main relationship</w:t>
             </w:r>
           </w:p>
         </w:tc>
@@ -4675,7 +4675,7 @@
                 <w:color w:val="FFFFFF"/>
                 <w:sz w:val="18"/>
               </w:rPr>
-              <w:t>期次</w:t>
+              <w:t>Phase</w:t>
             </w:r>
           </w:p>
         </w:tc>
@@ -4712,7 +4712,7 @@
                 <w:color w:val="000000"/>
                 <w:sz w:val="18"/>
               </w:rPr>
-              <w:t>身份</w:t>
+              <w:t>Identity</w:t>
             </w:r>
           </w:p>
         </w:tc>
@@ -4744,7 +4744,7 @@
                 <w:color w:val="000000"/>
                 <w:sz w:val="18"/>
               </w:rPr>
-              <w:t>User → Membership → Workspace；Mailbox 属于 Workspace</w:t>
+              <w:t>User → Membership → Workspace; Mailbox belongs to Workspace</w:t>
             </w:r>
           </w:p>
         </w:tc>
@@ -4776,7 +4776,7 @@
                 <w:color w:val="000000"/>
                 <w:sz w:val="18"/>
               </w:rPr>
-              <w:t>P1归属 P2认证</w:t>
+              <w:t>P1 belongs to P2 authentication</w:t>
             </w:r>
           </w:p>
         </w:tc>
@@ -4813,7 +4813,7 @@
                 <w:color w:val="000000"/>
                 <w:sz w:val="18"/>
               </w:rPr>
-              <w:t>画像</w:t>
+              <w:t>Persona</w:t>
             </w:r>
           </w:p>
         </w:tc>
@@ -4914,7 +4914,7 @@
                 <w:color w:val="000000"/>
                 <w:sz w:val="18"/>
               </w:rPr>
-              <w:t>联系人</w:t>
+              <w:t>Contact</w:t>
             </w:r>
           </w:p>
         </w:tc>
@@ -4946,7 +4946,7 @@
                 <w:color w:val="000000"/>
                 <w:sz w:val="18"/>
               </w:rPr>
-              <w:t>Contact → ContactEmail / ContactDomainProfile；列表多对多</w:t>
+              <w:t>Contact → ContactEmail / ContactDomainProfile; many-to-many list</w:t>
             </w:r>
           </w:p>
         </w:tc>
@@ -5015,7 +5015,7 @@
                 <w:color w:val="000000"/>
                 <w:sz w:val="18"/>
               </w:rPr>
-              <w:t>匹配</w:t>
+              <w:t>Matching</w:t>
             </w:r>
           </w:p>
         </w:tc>
@@ -5116,7 +5116,7 @@
                 <w:color w:val="000000"/>
                 <w:sz w:val="18"/>
               </w:rPr>
-              <w:t>写作</w:t>
+              <w:t>Writing</w:t>
             </w:r>
           </w:p>
         </w:tc>
@@ -5148,7 +5148,7 @@
                 <w:color w:val="000000"/>
                 <w:sz w:val="18"/>
               </w:rPr>
-              <w:t>Draft → DraftRevision；GenerationRun 引用输入及候选</w:t>
+              <w:t>Draft → DraftRevision; GenerationRun references input and candidates</w:t>
             </w:r>
           </w:p>
         </w:tc>
@@ -5217,7 +5217,7 @@
                 <w:color w:val="000000"/>
                 <w:sz w:val="18"/>
               </w:rPr>
-              <w:t>发送</w:t>
+              <w:t>Send</w:t>
             </w:r>
           </w:p>
         </w:tc>
@@ -5249,7 +5249,7 @@
                 <w:color w:val="000000"/>
                 <w:sz w:val="18"/>
               </w:rPr>
-              <w:t>SendJob → 冻结内容 + Mailbox；SendAttempt 记录每次提交</w:t>
+              <w:t>SendJob → frozen content + Mailbox; SendAttempt records each submission</w:t>
             </w:r>
           </w:p>
         </w:tc>
@@ -5318,7 +5318,7 @@
                 <w:color w:val="000000"/>
                 <w:sz w:val="18"/>
               </w:rPr>
-              <w:t>会话</w:t>
+              <w:t>Session</w:t>
             </w:r>
           </w:p>
         </w:tc>
@@ -5350,7 +5350,7 @@
                 <w:color w:val="000000"/>
                 <w:sz w:val="18"/>
               </w:rPr>
-              <w:t>Mailbox → Thread → Message；关联 Contact 及领域</w:t>
+              <w:t>Mailbox → Thread → Message; associates Contact and domain</w:t>
             </w:r>
           </w:p>
         </w:tc>
@@ -5419,7 +5419,7 @@
                 <w:color w:val="000000"/>
                 <w:sz w:val="18"/>
               </w:rPr>
-              <w:t>跟进</w:t>
+              <w:t>Follow-up</w:t>
             </w:r>
           </w:p>
         </w:tc>
@@ -5451,7 +5451,7 @@
                 <w:color w:val="000000"/>
                 <w:sz w:val="18"/>
               </w:rPr>
-              <w:t>FollowUpTask → Contact / Thread，不派生自动邮件</w:t>
+              <w:t>FollowUpTask → Contact / Thread, does not derive automated email</w:t>
             </w:r>
           </w:p>
         </w:tc>
@@ -5520,7 +5520,7 @@
                 <w:color w:val="000000"/>
                 <w:sz w:val="18"/>
               </w:rPr>
-              <w:t>活动</w:t>
+              <w:t>Activity</w:t>
             </w:r>
           </w:p>
         </w:tc>
@@ -5596,12 +5596,12 @@
         <w:pStyle w:val="Heading2"/>
       </w:pPr>
       <w:r>
-        <w:t>不可变与可变数据</w:t>
+        <w:t>Immutable and Mutable Data</w:t>
       </w:r>
     </w:p>
     <w:p>
       <w:r>
-        <w:t>画像版本、已批准发送快照和 provider message ID 不随模板或联系人更新改写。联系人展示资料可以更新，但旧邮件中使用的公司名称保留在当时的内容快照中。删除源文件时保留还是清除派生证据由删除流程明确提示；不要通过删除数据库行意外破坏邮件审计。</w:t>
+        <w:t>Persona version, approved send snapshots, and provider message ID are not rewritten with template or contact updates. Contact profile information can be updated, but the company name used in old emails is retained in the snapshot at the time. Whether to retain or clear derived evidence when deleting source files is explicitly prompted by the deletion process; do not inadvertently break email audit by deleting database rows.</w:t>
       </w:r>
     </w:p>
     <w:p>
@@ -5609,12 +5609,12 @@
         <w:pStyle w:val="Heading2"/>
       </w:pPr>
       <w:r>
-        <w:t>状态分离</w:t>
+        <w:t>State Separation</w:t>
       </w:r>
     </w:p>
     <w:p>
       <w:r>
-        <w:t>Draft 的 editing/ready 与 Save 的 saving/saved/conflict 不同；SendJob 的 queued/sending/sent/unknown 不同于 Contact 的未联系/已联系/已回复；Mailbox 的 connected/reauth_required/disconnected 独立。状态变化保存原因与时间，避免一列 status 承担所有含义。</w:t>
+        <w:t>Draft's editing/ready differs from Save's saving/saved/conflict; SendJob's queued/sending/sent/unknown differs from Contact's uncontacted/contacted/replied; Mailbox's connected/reauth_required/disconnected are independent. Status changes are saved with reason and time, avoiding one column of status carrying all meanings.</w:t>
       </w:r>
     </w:p>
     <w:p>
@@ -5627,12 +5627,12 @@
         <w:pStyle w:val="Heading1"/>
       </w:pPr>
       <w:r>
-        <w:t>09 技术架构与分期接入</w:t>
+        <w:t>09 Technical Architecture and Phased Integration</w:t>
       </w:r>
     </w:p>
     <w:p>
       <w:r>
-        <w:t>采用 Next.js 前端、FastAPI 业务服务与 PostgreSQL。前端不直连提供商或数据库。默认模块化单体，一期不引入 Redis；第二期因为定时发送再加入 Redis、Worker 和可靠任务记录。</w:t>
+        <w:t>Frontend uses Next.js, business services use FastAPI and PostgreSQL. Frontend does not connect directly to providers or databases. Default modular monolith, no Redis in phase one; Redis, Worker, and reliable task records are added in phase two due to scheduled sending.</w:t>
       </w:r>
     </w:p>
     <w:tbl>
@@ -5680,7 +5680,7 @@
                 <w:color w:val="FFFFFF"/>
                 <w:sz w:val="18"/>
               </w:rPr>
-              <w:t>层</w:t>
+              <w:t>Layer</w:t>
             </w:r>
           </w:p>
         </w:tc>
@@ -5712,7 +5712,7 @@
                 <w:color w:val="FFFFFF"/>
                 <w:sz w:val="18"/>
               </w:rPr>
-              <w:t>职责</w:t>
+              <w:t>Responsibility</w:t>
             </w:r>
           </w:p>
         </w:tc>
@@ -5744,7 +5744,7 @@
                 <w:color w:val="FFFFFF"/>
                 <w:sz w:val="18"/>
               </w:rPr>
-              <w:t>接入时间</w:t>
+              <w:t>Access Time</w:t>
             </w:r>
           </w:p>
         </w:tc>
@@ -5813,7 +5813,7 @@
                 <w:color w:val="000000"/>
                 <w:sz w:val="18"/>
               </w:rPr>
-              <w:t>页面、编辑器、i18n、预览交互；不保存凭据</w:t>
+              <w:t>Pages, editor, i18n, preview interaction; does not save credentials</w:t>
             </w:r>
           </w:p>
         </w:tc>
@@ -5914,7 +5914,7 @@
                 <w:color w:val="000000"/>
                 <w:sz w:val="18"/>
               </w:rPr>
-              <w:t>归属校验、Persona、Contact、Draft、变量渲染</w:t>
+              <w:t>Ownership validation, Persona, Contact, Draft, variable rendering</w:t>
             </w:r>
           </w:p>
         </w:tc>
@@ -6015,7 +6015,7 @@
                 <w:color w:val="000000"/>
                 <w:sz w:val="18"/>
               </w:rPr>
-              <w:t>查询规范化、证据、推荐和写作编排</w:t>
+              <w:t>Query normalization, evidence, recommendations, and writing orchestration</w:t>
             </w:r>
           </w:p>
         </w:tc>
@@ -6116,7 +6116,7 @@
                 <w:color w:val="000000"/>
                 <w:sz w:val="18"/>
               </w:rPr>
-              <w:t>Apollo 联系人与邮箱；SerpAPI 的 LinkedIn 公开检索；AI 写作</w:t>
+              <w:t>Apollo contacts and emails; SerpAPI's LinkedIn public retrieval; AI writing</w:t>
             </w:r>
           </w:p>
         </w:tc>
@@ -6217,7 +6217,7 @@
                 <w:color w:val="000000"/>
                 <w:sz w:val="18"/>
               </w:rPr>
-              <w:t>业务事实、版本、任务；私有文件存储</w:t>
+              <w:t>Business facts, versions, tasks; private file storage</w:t>
             </w:r>
           </w:p>
         </w:tc>
@@ -6318,7 +6318,7 @@
                 <w:color w:val="000000"/>
                 <w:sz w:val="18"/>
               </w:rPr>
-              <w:t>平台会话、多邮箱OAuth、发送身份</w:t>
+              <w:t>Platform session, multi-mailbox OAuth, sending identity</w:t>
             </w:r>
           </w:p>
         </w:tc>
@@ -6419,7 +6419,7 @@
                 <w:color w:val="000000"/>
                 <w:sz w:val="18"/>
               </w:rPr>
-              <w:t>任务唤醒与执行；PostgreSQL保存权威状态</w:t>
+              <w:t>Task wake-up and execution; PostgreSQL stores authoritative state</w:t>
             </w:r>
           </w:p>
         </w:tc>
@@ -6520,7 +6520,7 @@
                 <w:color w:val="000000"/>
                 <w:sz w:val="18"/>
               </w:rPr>
-              <w:t>游标同步、回复关联、平台提醒</w:t>
+              <w:t>Cursor synchronization, reply association, platform reminders</w:t>
             </w:r>
           </w:p>
         </w:tc>
@@ -6621,7 +6621,7 @@
                 <w:color w:val="000000"/>
                 <w:sz w:val="18"/>
               </w:rPr>
-              <w:t>逐人批准、活动控制、事件统计</w:t>
+              <w:t>Per-person approval, activity control, event statistics</w:t>
             </w:r>
           </w:p>
         </w:tc>
@@ -6665,12 +6665,12 @@
         <w:pStyle w:val="Heading2"/>
       </w:pPr>
       <w:r>
-        <w:t>一次写作请求</w:t>
+        <w:t>One Writing Request</w:t>
       </w:r>
     </w:p>
     <w:p>
       <w:r>
-        <w:t>浏览器提交 Brief、联系人 ID 和画像版本 → API 校验工作区 → 读取允许事实 → AIProvider 生成结构化建议 → 服务端校验引用与变量 → 保存 GenerationRun → 返回建议区 → 用户采纳 → 保存 DraftRevision。模型在这条路径没有邮件发送权限。</w:t>
+        <w:t>Browser submits Brief, contact ID, and persona version → API validates workspace → reads allowed facts → AIProvider generates structured suggestions → server validates references and variables → saves GenerationRun → returns suggestions area → user adopts → saves DraftRevision. The model has no permission to send emails along this path.</w:t>
       </w:r>
     </w:p>
     <w:p>
@@ -6678,12 +6678,12 @@
         <w:pStyle w:val="Heading2"/>
       </w:pPr>
       <w:r>
-        <w:t>一次定时发送</w:t>
+        <w:t>One Scheduled Send</w:t>
       </w:r>
     </w:p>
     <w:p>
       <w:r>
-        <w:t>用户预览并批准 → 数据库事务写入快照及 SendJob → Worker 定期扫描数据库到期任务/消费队列 → 再次检查邮箱、窗口、取消及屏蔽 → 记录 SendAttempt → Gmail 提交 → 保存 provider ID 或 unknown。事务外的队列通知失败可由扫描恢复，不把 Redis 作为唯一来源。</w:t>
+        <w:t>User previews and approves → database transaction writes snapshot and SendJob → Worker periodically scans database expired tasks/consumes queue → rechecks email, window, cancellation, and blocking → records SendAttempt → Gmail submission → saves provider ID or unknown. Queue notifications outside of transaction can be recovered by scanning, and Redis is not the sole source.</w:t>
       </w:r>
     </w:p>
     <w:p>
@@ -6696,12 +6696,12 @@
         <w:pStyle w:val="Heading1"/>
       </w:pPr>
       <w:r>
-        <w:t>10 核心接口与错误契约</w:t>
+        <w:t>10 Core Interfaces and Error Contracts</w:t>
       </w:r>
     </w:p>
     <w:p>
       <w:r>
-        <w:t>以下是实现建议，不是声称存在的第三方端点。对外接口共享 request_id、错误 code、用户可读 message 和可选 field_errors。后端从会话取得 workspace，不能信任客户端任意传入的 workspace_id。</w:t>
+        <w:t>The following are implementation suggestions, not third-party endpoints that exist. External interfaces share request_id, error code, user-readable message, and optional field_errors. Backend retrieves workspace from session, cannot trust client-provided workspace_id.</w:t>
       </w:r>
     </w:p>
     <w:tbl>
@@ -6749,7 +6749,7 @@
                 <w:color w:val="FFFFFF"/>
                 <w:sz w:val="18"/>
               </w:rPr>
-              <w:t>接口</w:t>
+              <w:t>Interface</w:t>
             </w:r>
           </w:p>
         </w:tc>
@@ -6781,7 +6781,7 @@
                 <w:color w:val="FFFFFF"/>
                 <w:sz w:val="18"/>
               </w:rPr>
-              <w:t>输入与输出</w:t>
+              <w:t>Input and Output</w:t>
             </w:r>
           </w:p>
         </w:tc>
@@ -6813,7 +6813,7 @@
                 <w:color w:val="FFFFFF"/>
                 <w:sz w:val="18"/>
               </w:rPr>
-              <w:t>规则</w:t>
+              <w:t>Rules</w:t>
             </w:r>
           </w:p>
         </w:tc>
@@ -6914,7 +6914,7 @@
                 <w:color w:val="000000"/>
                 <w:sz w:val="18"/>
               </w:rPr>
-              <w:t>明确未支持筛选</w:t>
+              <w:t>Explicitly unsupported filtering</w:t>
             </w:r>
           </w:p>
         </w:tc>
@@ -7015,7 +7015,7 @@
                 <w:color w:val="000000"/>
                 <w:sz w:val="18"/>
               </w:rPr>
-              <w:t>有限批量且按需调用</w:t>
+              <w:t>Limited batching and on-demand invocation</w:t>
             </w:r>
           </w:p>
         </w:tc>
@@ -7116,7 +7116,7 @@
                 <w:color w:val="000000"/>
                 <w:sz w:val="18"/>
               </w:rPr>
-              <w:t>记录来源及版本</w:t>
+              <w:t>Record source and version</w:t>
             </w:r>
           </w:p>
         </w:tc>
@@ -7217,7 +7217,7 @@
                 <w:color w:val="000000"/>
                 <w:sz w:val="18"/>
               </w:rPr>
-              <w:t>409保留双方内容</w:t>
+              <w:t>409 preserves both contents</w:t>
             </w:r>
           </w:p>
         </w:tc>
@@ -7318,7 +7318,7 @@
                 <w:color w:val="000000"/>
                 <w:sz w:val="18"/>
               </w:rPr>
-              <w:t>统一变量渲染器</w:t>
+              <w:t>Unified variable renderer</w:t>
             </w:r>
           </w:p>
         </w:tc>
@@ -7419,7 +7419,7 @@
                 <w:color w:val="000000"/>
                 <w:sz w:val="18"/>
               </w:rPr>
-              <w:t>幂等；二期启用</w:t>
+              <w:t>Idempotent; Phase 2 enabled</w:t>
             </w:r>
           </w:p>
         </w:tc>
@@ -7488,7 +7488,7 @@
                 <w:color w:val="000000"/>
                 <w:sz w:val="18"/>
               </w:rPr>
-              <w:t>持久游标 → sync_run</w:t>
+              <w:t>Persistent cursor → sync_run</w:t>
             </w:r>
           </w:p>
         </w:tc>
@@ -7520,7 +7520,7 @@
                 <w:color w:val="000000"/>
                 <w:sz w:val="18"/>
               </w:rPr>
-              <w:t>三期；恢复可观察</w:t>
+              <w:t>Phase 3; recover observability</w:t>
             </w:r>
           </w:p>
         </w:tc>
@@ -7621,7 +7621,7 @@
                 <w:color w:val="000000"/>
                 <w:sz w:val="18"/>
               </w:rPr>
-              <w:t>只提醒不发信</w:t>
+              <w:t>Only remind, no sending</w:t>
             </w:r>
           </w:p>
         </w:tc>
@@ -7690,7 +7690,7 @@
                 <w:color w:val="000000"/>
                 <w:sz w:val="18"/>
               </w:rPr>
-              <w:t>审阅版本与逐人快照 → jobs</w:t>
+              <w:t>Review version and per-person snapshot → jobs</w:t>
             </w:r>
           </w:p>
         </w:tc>
@@ -7722,7 +7722,7 @@
                 <w:color w:val="000000"/>
                 <w:sz w:val="18"/>
               </w:rPr>
-              <w:t>四期；逐人预检</w:t>
+              <w:t>Phase 4; per-person pre-check</w:t>
             </w:r>
           </w:p>
         </w:tc>
@@ -7734,12 +7734,12 @@
         <w:pStyle w:val="Heading2"/>
       </w:pPr>
       <w:r>
-        <w:t>错误分类</w:t>
+        <w:t>Error Classification</w:t>
       </w:r>
     </w:p>
     <w:p>
       <w:r>
-        <w:t>VALIDATION_ERROR 定位缺失字段；REVISION_CONFLICT 表示草稿或审阅快照过期；PROVIDER_UNCONFIGURED 提示设置；PROVIDER_FORBIDDEN 与 RATE_LIMITED 不混用；GENERATION_INVALID 保留原稿；MAILBOX_REAUTH_REQUIRED 暂停相关任务；SEND_OUTCOME_UNKNOWN 转核对。服务端日志可定位 request_id，但不默认记录敏感正文。</w:t>
+        <w:t>VALIDATION_ERROR indicates missing fields; REVISION_CONFLICT indicates draft or review snapshot is outdated; PROVIDER_UNCONFIGURED indicates configuration is required; PROVIDER_FORBIDDEN and RATE_LIMITED should not be mixed; GENERATION_INVALID preserves the original draft; MAILBOX_REAUTH_REQUIRED pauses related tasks; SEND_OUTCOME_UNKNOWN redirects to verification. Server logs can locate request_id, but do not default record sensitive content.</w:t>
       </w:r>
     </w:p>
     <w:p>
@@ -7747,12 +7747,12 @@
         <w:pStyle w:val="Heading2"/>
       </w:pPr>
       <w:r>
-        <w:t>Academic 契约</w:t>
+        <w:t>Academic Contract</w:t>
       </w:r>
     </w:p>
     <w:p>
       <w:r>
-        <w:t>MentorDataProvider.search(criteria,cursor) 与 get(id) 返回统一 Mentor、SourceEvidence、分页与 capabilities。JSONL、SQLite、Postgres、External 注册到同一工厂。第四期只交付结构与契约测试，未实现返回 Unavailable，不使用假数据库代替真实数据。</w:t>
+        <w:t>MentorDataProvider.search(criteria, cursor) and get(id) return unified Mentor, SourceEvidence, pagination, and capabilities. JSONL, SQLite, Postgres, and External are registered to the same factory. Phase four delivers only structure and contract testing, returns Unavailable when no provider is implemented, and does not use fake databases to replace real data.</w:t>
       </w:r>
     </w:p>
     <w:p>
@@ -7765,7 +7765,7 @@
         <w:pStyle w:val="Heading1"/>
       </w:pPr>
       <w:r>
-        <w:t>11 第二期邮箱与发送设计</w:t>
+        <w:t>11 Phase Two Email and Sending Design</w:t>
       </w:r>
     </w:p>
     <w:p>
@@ -7773,17 +7773,17 @@
         <w:pStyle w:val="Heading2"/>
       </w:pPr>
       <w:r>
-        <w:t>登录和授权</w:t>
+        <w:t>Login and Authorization</w:t>
       </w:r>
     </w:p>
     <w:p>
       <w:r>
-        <w:t>Google 平台登录负责“你是谁”；Gmail OAuth 负责“允许平台访问哪个邮箱”。同一用户可连接不同于登录地址的多个 Gmail。第二期必须先完成身份与工作区隔离，再接入真实邮件；第一期本地数据只有明确认领流程后才迁移。</w:t>
+        <w:t>Google platform login handles 'who you are'; Gmail OAuth handles 'which email the platform is allowed to access'. One user can connect multiple Gmail mailboxes with different login addresses. Phase two must complete identity and workspace isolation before integrating real emails; phase one local data is only migrated after clear ownership process.</w:t>
       </w:r>
     </w:p>
     <w:p>
       <w:r>
-        <w:t>OAuth 凭据在服务端加密，state 绑定会话，按适用流程使用 PKCE。断连停止同步及未发任务，清除不再使用的授权凭据。权限按实际读写需求申请，公开应用的验证要求与本地测试区别记录［S03］。平台签名无需改写 Gmail 原生设置。</w:t>
+        <w:t>OAuth credentials are encrypted on the server, state is bound to session, and PKCE is used per applicable process. Disconnection stops synchronization and un-sent tasks, and clears unused authorization credentials. Permissions are applied based on actual read/write needs, and validation requirements for public applications are recorded separately from local testing [S03]. Platform signing does not rewrite Gmail native settings.</w:t>
       </w:r>
     </w:p>
     <w:p>
@@ -7791,12 +7791,12 @@
         <w:pStyle w:val="Heading2"/>
       </w:pPr>
       <w:r>
-        <w:t>预检与确认</w:t>
+        <w:t>Pre-check and Confirmation</w:t>
       </w:r>
     </w:p>
     <w:p>
       <w:r>
-        <w:t>用户确认实际邮箱、收件人、主题、正文、变量、签名和附件。发送快照记录内容 revision、收件地址及批准时间。测试发送默认用户自己的指定地址，联系人只用于渲染变量；测试不能更新正式触达状态。未验证或未知邮箱不自动标为安全，已知硬退信及禁止发送地址阻断。</w:t>
+        <w:t>User confirms actual email, recipient, subject, body, variables, signature, and attachments. Sends snapshot record content revision, recipient address, and approval time. Test sends default to the user's own specified address; contacts are only used for rendering variables; testing cannot update the formal delivery status. Unverified or unknown emails are not automatically marked as safe; known hard bounces and prohibited sending addresses are blocked.</w:t>
       </w:r>
     </w:p>
     <w:p>
@@ -7804,12 +7804,12 @@
         <w:pStyle w:val="Heading2"/>
       </w:pPr>
       <w:r>
-        <w:t>任务可靠性</w:t>
+        <w:t>Task Reliability</w:t>
       </w:r>
     </w:p>
     <w:p>
       <w:r>
-        <w:t>客户端提交幂等键，数据库约束和锁阻止重复任务。Gmail 请求不被假定支持业务幂等键；网络超时可能意味着已发出，因此进入 unknown，核对 provider 记录或人工检查后才决定下一步。系统不承诺 exactly-once 的外部投递。sent 表示提供商接受，不是已送达或已读。</w:t>
+        <w:t>Client submits an idempotency key; database constraints and locks prevent duplicate tasks. Gmail requests are not assumed to support business idempotency keys; network timeouts may indicate the message has been sent, so it enters unknown status. Next steps are decided only after checking provider records or manual verification. The system does not guarantee exactly-once delivery externally. 'Sent' indicates the provider accepted it, not that it was delivered or read.</w:t>
       </w:r>
     </w:p>
     <w:tbl>
@@ -7856,7 +7856,7 @@
                 <w:color w:val="FFFFFF"/>
                 <w:sz w:val="18"/>
               </w:rPr>
-              <w:t>场景</w:t>
+              <w:t>Scenario</w:t>
             </w:r>
           </w:p>
         </w:tc>
@@ -7888,7 +7888,7 @@
                 <w:color w:val="FFFFFF"/>
                 <w:sz w:val="18"/>
               </w:rPr>
-              <w:t>系统行为</w:t>
+              <w:t>System behavior</w:t>
             </w:r>
           </w:p>
         </w:tc>
@@ -7925,7 +7925,7 @@
                 <w:color w:val="000000"/>
                 <w:sz w:val="18"/>
               </w:rPr>
-              <w:t>授权过期</w:t>
+              <w:t>Authorization expiration</w:t>
             </w:r>
           </w:p>
         </w:tc>
@@ -7957,7 +7957,7 @@
                 <w:color w:val="000000"/>
                 <w:sz w:val="18"/>
               </w:rPr>
-              <w:t>刷新或要求重授权；暂停相关任务</w:t>
+              <w:t>Refresh or request reauthorization; pause related tasks</w:t>
             </w:r>
           </w:p>
         </w:tc>
@@ -7994,7 +7994,7 @@
                 <w:color w:val="000000"/>
                 <w:sz w:val="18"/>
               </w:rPr>
-              <w:t>限流与临时失败</w:t>
+              <w:t>Rate limiting and temporary failures</w:t>
             </w:r>
           </w:p>
         </w:tc>
@@ -8026,7 +8026,7 @@
                 <w:color w:val="000000"/>
                 <w:sz w:val="18"/>
               </w:rPr>
-              <w:t>有界退避，保留尝试记录</w:t>
+              <w:t>Bounded backoff, retain attempt records</w:t>
             </w:r>
           </w:p>
         </w:tc>
@@ -8063,7 +8063,7 @@
                 <w:color w:val="000000"/>
                 <w:sz w:val="18"/>
               </w:rPr>
-              <w:t>非发送时段</w:t>
+              <w:t>Non-sending period</w:t>
             </w:r>
           </w:p>
         </w:tc>
@@ -8095,7 +8095,7 @@
                 <w:color w:val="000000"/>
                 <w:sz w:val="18"/>
               </w:rPr>
-              <w:t>按邮箱时区移动到下个合法窗口</w:t>
+              <w:t>Move to next legal window by email timezone</w:t>
             </w:r>
           </w:p>
         </w:tc>
@@ -8132,7 +8132,7 @@
                 <w:color w:val="000000"/>
                 <w:sz w:val="18"/>
               </w:rPr>
-              <w:t>取消与断连</w:t>
+              <w:t>Cancellation and disconnection</w:t>
             </w:r>
           </w:p>
         </w:tc>
@@ -8164,7 +8164,7 @@
                 <w:color w:val="000000"/>
                 <w:sz w:val="18"/>
               </w:rPr>
-              <w:t>实际提交前再次检查；已提交不可假装撤回</w:t>
+              <w:t>Recheck before actual submission; submitted messages cannot pretend to be revoked</w:t>
             </w:r>
           </w:p>
         </w:tc>
@@ -8201,7 +8201,7 @@
                 <w:color w:val="000000"/>
                 <w:sz w:val="18"/>
               </w:rPr>
-              <w:t>响应超时结果未知</w:t>
+              <w:t>Response timeout result unknown</w:t>
             </w:r>
           </w:p>
         </w:tc>
@@ -8233,7 +8233,7 @@
                 <w:color w:val="000000"/>
                 <w:sz w:val="18"/>
               </w:rPr>
-              <w:t>停止盲目重试，进入核对流程</w:t>
+              <w:t>Stop blind retries, enter verification process</w:t>
             </w:r>
           </w:p>
         </w:tc>
@@ -8250,7 +8250,7 @@
         <w:pStyle w:val="Heading1"/>
       </w:pPr>
       <w:r>
-        <w:t>12 第三期收件箱与手动跟进</w:t>
+        <w:t>12 Inbox and Manual Follow-Up (Phase 3)</w:t>
       </w:r>
     </w:p>
     <w:p>
@@ -8258,17 +8258,17 @@
         <w:pStyle w:val="Heading2"/>
       </w:pPr>
       <w:r>
-        <w:t>同步和会话</w:t>
+        <w:t>Synchronization and Session</w:t>
       </w:r>
     </w:p>
     <w:p>
       <w:r>
-        <w:t>首次获取最近 30 天并分页，持续跟踪平台进行中的旧会话。增量使用 history 游标；游标过期时恢复同步［S04］。第一版默认两分钟轮询与手动刷新，不写成实时推送。每个邮箱独立存 provider ID，避免多个邮箱中的相同主题被误并。</w:t>
+        <w:t>First fetch the most recent 30 days and paginate; continuously track ongoing sessions on the platform. Use history cursor for incremental sync; recover synchronization when the cursor expires [S04]. The first version defaults to two-minute polling and manual refresh, not real-time push. Each email has an independent provider ID to avoid mis-merging the same subject across multiple emails.</w:t>
       </w:r>
     </w:p>
     <w:p>
       <w:r>
-        <w:t>三栏 Inbox 显示筛选、会话及正文和联系人。回复保留 Gmail threadId、References、In-Reply-To 和主题关系［S05］。已读/归档同步 Gmail；备注、意向与任务留在平台。邮件 HTML 清理，远程图片默认不加载；附件先显示文件名与大小，未支持的预览明确说明。</w:t>
+        <w:t>Three-column Inbox displays filtering, session, and body and contact. Replies retain Gmail threadId, References, In-Reply-To, and subject relationships [S05]. Read/Archive syncs with Gmail; notes, intent, and tasks remain on the platform. Email HTML is cleaned; remote images do not load by default; attachments first show filename and size, with clear indication for unsupported previews.</w:t>
       </w:r>
     </w:p>
     <w:p>
@@ -8276,12 +8276,12 @@
         <w:pStyle w:val="Heading2"/>
       </w:pPr>
       <w:r>
-        <w:t>新回复对排期的影响</w:t>
+        <w:t>Impact of New Replies on Scheduling</w:t>
       </w:r>
     </w:p>
     <w:p>
       <w:r>
-        <w:t>一旦检测到新的回复，暂停该联系人已存在且未发送的任务并显示原因。人工、自动和未知回复分别展示；无法判断时保守暂停。此规则只保护已有排期，不创建下一封邮件。同步失败时应提示状态不新鲜，并暂停需要最新回复检查的发送，外部到达竞态仍需说明。</w:t>
+        <w:t>Once a new reply is detected, pause existing tasks for that contact that have not been sent and display the reason. Manual, automatic, and unknown replies are shown separately; when uncertain, pause conservatively. This rule only protects existing schedules and does not create the next email. If synchronization fails, prompt the status is stale and pause sending that requires checking the latest reply, while external arrival race conditions must still be explained.</w:t>
       </w:r>
     </w:p>
     <w:p>
@@ -8289,12 +8289,12 @@
         <w:pStyle w:val="Heading2"/>
       </w:pPr>
       <w:r>
-        <w:t>手动跟进</w:t>
+        <w:t>Manual Follow-Up</w:t>
       </w:r>
     </w:p>
     <w:p>
       <w:r>
-        <w:t>用户创建 FollowUpTask，填写日期和备注。到期只在平台提醒；点击任务才打开原会话，可以手写、使用模板或请求 AI。即使请求 AI，也只产生建议稿，再由用户明确发送或排期。完成/改期/取消任务都不派生自动邮件。</w:t>
+        <w:t>User creates a FollowUpTask, fills in the date and notes. Reminders only occur on the platform; clicking the task opens the original session, allowing manual input, using templates, or requesting AI. Even if AI is requested, only draft suggestions are generated, and the user must explicitly send or schedule them. Completed, rescheduled, or canceled tasks do not generate automatic emails.</w:t>
       </w:r>
     </w:p>
     <w:p>
@@ -8302,12 +8302,12 @@
         <w:pStyle w:val="Heading2"/>
       </w:pPr>
       <w:r>
-        <w:t>退订和拒绝</w:t>
+        <w:t>Unsubscribe and Rejection</w:t>
       </w:r>
     </w:p>
     <w:p>
       <w:r>
-        <w:t>工作区级 SuppressionEntry 以规范化邮箱为主键范围，记录原因与来源，不允许通过切换发件邮箱绕过。已知硬退信、退订和人工确认的拒绝分别处理。退订链接使用不可猜测的签名令牌，页面执行真实屏蔽；本地演示仅模拟该动作，不假装链接已公开部署。</w:t>
+        <w:t>Workspace-level SuppressionEntry uses normalized email as the primary key range, records the reason and source, and does not allow bypassing by switching sender emails. Known hard bounces, unsubscribes, and manually confirmed rejections are handled separately. Unsubscribe links use non-guessable signed tokens; pages perform real blocking; local demos only simulate the action without pretending the link is publicly deployed.</w:t>
       </w:r>
     </w:p>
     <w:p>
@@ -8320,7 +8320,7 @@
         <w:pStyle w:val="Heading1"/>
       </w:pPr>
       <w:r>
-        <w:t>13 第四期活动与产品完善</w:t>
+        <w:t>13 Phase Four Campaigns and Product Refinement</w:t>
       </w:r>
     </w:p>
     <w:p>
@@ -8328,17 +8328,17 @@
         <w:pStyle w:val="Heading2"/>
       </w:pPr>
       <w:r>
-        <w:t>Campaign 的有限含义</w:t>
+        <w:t>Limited Meaning of Campaign</w:t>
       </w:r>
     </w:p>
     <w:p>
       <w:r>
-        <w:t>Campaign 是一组用户批准的独立邮件任务，不是自动序列。用户选择名单后逐人生成/编辑，统一看异常，再明确批准。CampaignRecipient 固定收件人、画像版本、内容快照、邮箱及时间。系统绝不根据未回复和等待天数自动派生第二封。</w:t>
+        <w:t>Campaign is a group of independently approved email tasks by users, not an automated email sequence. After users select a list, each recipient is individually generated or edited, with unified error checking, and then explicitly approved. CampaignRecipient includes fixed recipient, persona version, content snapshot, email, and time. The system never automatically generates a second email based on no response or waiting days.</w:t>
       </w:r>
     </w:p>
     <w:p>
       <w:r>
-        <w:t>批量预检展示重复、缺少变量、无可用地址、屏蔽、窗口和附件问题。用户可以明确排除异常人，不能静默跳过。逐人邮件有独立 To，不通过群发 CC 暴露其他联系人。暂停、恢复、终止和单人退出复用发送状态；恢复重算窗口，不瞬间补发逾期任务。</w:t>
+        <w:t>Batch Pre-Check Displays Duplicates, Missing Variables, No Available Addresses, Suppression, Window, and Attachment Issues. Users can explicitly exclude abnormal recipients and cannot silently skip. Each individual email has an independent To, not exposed through mass CC. Pause, resume, terminate, and single-exit reuse sending status; resume recalculates the window, not instantly resending overdue tasks.</w:t>
       </w:r>
     </w:p>
     <w:p>
@@ -8346,12 +8346,12 @@
         <w:pStyle w:val="Heading2"/>
       </w:pPr>
       <w:r>
-        <w:t>模板与统计</w:t>
+        <w:t>Templates and Statistics</w:t>
       </w:r>
     </w:p>
     <w:p>
       <w:r>
-        <w:t>Templates 与 Snippets 在第四期支持创建、编辑、版本和归档。更新模板不改已批准内容。Academic 模板只有分类和示例，导师搜索仍 Coming Soon。</w:t>
+        <w:t>Templates and Snippets support creation, editing, versioning, and archiving in Phase 4. Updating templates does not change already approved content. Academic templates only have categories and examples; mentor search is still Coming Soon.</w:t>
       </w:r>
     </w:p>
     <w:tbl>
@@ -8398,7 +8398,7 @@
                 <w:color w:val="FFFFFF"/>
                 <w:sz w:val="18"/>
               </w:rPr>
-              <w:t>指标</w:t>
+              <w:t>Metrics</w:t>
             </w:r>
           </w:p>
         </w:tc>
@@ -8430,7 +8430,7 @@
                 <w:color w:val="FFFFFF"/>
                 <w:sz w:val="18"/>
               </w:rPr>
-              <w:t>建议口径</w:t>
+              <w:t>Recommended definition</w:t>
             </w:r>
           </w:p>
         </w:tc>
@@ -8467,7 +8467,7 @@
                 <w:color w:val="000000"/>
                 <w:sz w:val="18"/>
               </w:rPr>
-              <w:t>正式发送邮件数</w:t>
+              <w:t>Number of formal sent emails</w:t>
             </w:r>
           </w:p>
         </w:tc>
@@ -8499,7 +8499,7 @@
                 <w:color w:val="000000"/>
                 <w:sz w:val="18"/>
               </w:rPr>
-              <w:t>指定时间窗内 provider 接受的非测试消息数</w:t>
+              <w:t>Number of non-test messages accepted by provider within a specified time window</w:t>
             </w:r>
           </w:p>
         </w:tc>
@@ -8536,7 +8536,7 @@
                 <w:color w:val="000000"/>
                 <w:sz w:val="18"/>
               </w:rPr>
-              <w:t>正式触达人数</w:t>
+              <w:t>Number of formally reached persons</w:t>
             </w:r>
           </w:p>
         </w:tc>
@@ -8568,7 +8568,7 @@
                 <w:color w:val="000000"/>
                 <w:sz w:val="18"/>
               </w:rPr>
-              <w:t>同窗内成功提交收件地址或明确联系人去重数</w:t>
+              <w:t>Number of unique contacts with successful submission or clear contact deduplication within the same cohort</w:t>
             </w:r>
           </w:p>
         </w:tc>
@@ -8605,7 +8605,7 @@
                 <w:color w:val="000000"/>
                 <w:sz w:val="18"/>
               </w:rPr>
-              <w:t>人工回复人数</w:t>
+              <w:t>Number of manually replied persons</w:t>
             </w:r>
           </w:p>
         </w:tc>
@@ -8637,7 +8637,7 @@
                 <w:color w:val="000000"/>
                 <w:sz w:val="18"/>
               </w:rPr>
-              <w:t>触达 cohort 内被识别为人工回复的去重联系人</w:t>
+              <w:t>Number of unique contacts identified as manually replied within the reached cohort</w:t>
             </w:r>
           </w:p>
         </w:tc>
@@ -8674,7 +8674,7 @@
                 <w:color w:val="000000"/>
                 <w:sz w:val="18"/>
               </w:rPr>
-              <w:t>回复率</w:t>
+              <w:t>Response rate</w:t>
             </w:r>
           </w:p>
         </w:tc>
@@ -8706,7 +8706,7 @@
                 <w:color w:val="000000"/>
                 <w:sz w:val="18"/>
               </w:rPr>
-              <w:t>同一触达 cohort 的人工回复人数 / 正式触达人数；注明观察截止日</w:t>
+              <w:t>Number of manually replied persons in the same reached cohort / Number of formally reached persons; note observation cutoff date</w:t>
             </w:r>
           </w:p>
         </w:tc>
@@ -8743,7 +8743,7 @@
                 <w:color w:val="000000"/>
                 <w:sz w:val="18"/>
               </w:rPr>
-              <w:t>已检测退信及退订</w:t>
+              <w:t>Detected bounced emails and unsubscribes</w:t>
             </w:r>
           </w:p>
         </w:tc>
@@ -8775,7 +8775,7 @@
                 <w:color w:val="000000"/>
                 <w:sz w:val="18"/>
               </w:rPr>
-              <w:t>按事件分别统计，不推算所有投递结果</w:t>
+              <w:t>Statistically separate by event, do not infer all delivery results</w:t>
             </w:r>
           </w:p>
         </w:tc>
@@ -8787,12 +8787,12 @@
         <w:pStyle w:val="Heading2"/>
       </w:pPr>
       <w:r>
-        <w:t>不扩大的范围</w:t>
+        <w:t>Non-Expanded Scope</w:t>
       </w:r>
     </w:p>
     <w:p>
       <w:r>
-        <w:t>账户已在第二期建立，第四期只完善设置和维护。团队协作、计费、Outlook 真实集成、打开/点击追踪、邮箱轮换、预热和自动序列均不包含。Academic 数据存储技术尚未决定，不为契约设计提前建设真实导师数据库。</w:t>
+        <w:t>Accounts were established in Phase 2; Phase 4 only refines settings and maintenance. Team collaboration, billing, Outlook real integration, open/click tracking, email rotation, pre-warming, and automated email sequences are not included. Academic data storage technology has not been decided, and no real mentor database is built in advance for contractual design.</w:t>
       </w:r>
     </w:p>
     <w:p>
@@ -8805,7 +8805,7 @@
         <w:pStyle w:val="Heading1"/>
       </w:pPr>
       <w:r>
-        <w:t>14 安全边界与运行质量</w:t>
+        <w:t>14 Security Boundaries and Operational Quality</w:t>
       </w:r>
     </w:p>
     <w:p>
@@ -8813,12 +8813,12 @@
         <w:pStyle w:val="Heading2"/>
       </w:pPr>
       <w:r>
-        <w:t>个人信息与访问</w:t>
+        <w:t>Personal Information and Access</w:t>
       </w:r>
     </w:p>
     <w:p>
       <w:r>
-        <w:t>简历、邮箱内容和联系人信息均有工作区归属。生产模式需要真实会话；文件下载校验对象归属并采用短期受控链接。凭据加密密钥不与数据库同位置保存，日志去除 Token、原始简历及整封邮件。调用 AI 前仅发送当前任务需要的字段，界面说明外部处理范围。</w:t>
+        <w:t>Resumes, email content, and contact information are all workspace-bound. Production mode requires real sessions; file downloads validate object ownership and use short-lived controlled links. Credentials encryption keys are not stored in the same location as the database; logs remove tokens, original resumes, and full emails. Only send required fields for the current task to AI before invocation, with interface explanations of external processing scope.</w:t>
       </w:r>
     </w:p>
     <w:p>
@@ -8826,12 +8826,12 @@
         <w:pStyle w:val="Heading2"/>
       </w:pPr>
       <w:r>
-        <w:t>删除与保留</w:t>
+        <w:t>Deletion and Retention</w:t>
       </w:r>
     </w:p>
     <w:p>
       <w:r>
-        <w:t>支持删除简历原文件及用户业务资料，说明已生成草稿和来源片段是否同步删除。退订屏蔽是防止再次联系的独立记录，删除联系人不能悄悄删除屏蔽；涉及账户关闭的保留策略在公开上线前明确配置，不把本设计写成法律结论。</w:t>
+        <w:t>Support deletion of original resume files and user business data, explaining whether generated drafts and source fragments are synchronized for deletion. Unsubscribe suppression is an independent record to prevent further contact; deleting a contact cannot silently delete suppression; retention strategies involving account closure are clearly configured before public launch, not presented as legal conclusions.</w:t>
       </w:r>
     </w:p>
     <w:p>
@@ -8839,12 +8839,12 @@
         <w:pStyle w:val="Heading2"/>
       </w:pPr>
       <w:r>
-        <w:t>运行指标</w:t>
+        <w:t>Operational Metrics</w:t>
       </w:r>
     </w:p>
     <w:p>
       <w:r>
-        <w:t>记录 API request_id、Provider 错误分类、生成耗时和用量、Worker 任务年龄、同步时间、失败率及 unknown 待核对数量。通知必须有行动意义，不用不可验证的“健康”卡片掩盖失败。数据库备份、恢复演练、OAuth 审核和部署证书列为上线检查，不声称已经完成。</w:t>
+        <w:t>Record API request_id, Provider error classification, generation time and usage, Worker task age, sync time, failure rate, and unknown pending verification count. Notifications must have actionable meaning; do not use unverifiable 'health' cards to mask failures. Database backups, recovery drills, OAuth audits, and deployment certificates are listed as launch checks, not claimed as completed.</w:t>
       </w:r>
     </w:p>
     <w:p>
@@ -8852,7 +8852,7 @@
         <w:pStyle w:val="Heading2"/>
       </w:pPr>
       <w:r>
-        <w:t>建议默认配置</w:t>
+        <w:t>Recommended Default Configuration</w:t>
       </w:r>
     </w:p>
     <w:tbl>
@@ -8900,7 +8900,7 @@
                 <w:color w:val="FFFFFF"/>
                 <w:sz w:val="18"/>
               </w:rPr>
-              <w:t>参数</w:t>
+              <w:t>Parameters</w:t>
             </w:r>
           </w:p>
         </w:tc>
@@ -8932,7 +8932,7 @@
                 <w:color w:val="FFFFFF"/>
                 <w:sz w:val="18"/>
               </w:rPr>
-              <w:t>建议默认</w:t>
+              <w:t>Recommended default</w:t>
             </w:r>
           </w:p>
         </w:tc>
@@ -8964,7 +8964,7 @@
                 <w:color w:val="FFFFFF"/>
                 <w:sz w:val="18"/>
               </w:rPr>
-              <w:t>说明</w:t>
+              <w:t>Description</w:t>
             </w:r>
           </w:p>
         </w:tc>
@@ -9001,7 +9001,7 @@
                 <w:color w:val="000000"/>
                 <w:sz w:val="18"/>
               </w:rPr>
-              <w:t>文件上限</w:t>
+              <w:t>File limit</w:t>
             </w:r>
           </w:p>
         </w:tc>
@@ -9065,7 +9065,7 @@
                 <w:color w:val="000000"/>
                 <w:sz w:val="18"/>
               </w:rPr>
-              <w:t>可配置，类型及实际内容校验</w:t>
+              <w:t>Configurable, type and actual content validation</w:t>
             </w:r>
           </w:p>
         </w:tc>
@@ -9102,7 +9102,7 @@
                 <w:color w:val="000000"/>
                 <w:sz w:val="18"/>
               </w:rPr>
-              <w:t>英文生成长度</w:t>
+              <w:t>English generation length</w:t>
             </w:r>
           </w:p>
         </w:tc>
@@ -9166,7 +9166,7 @@
                 <w:color w:val="000000"/>
                 <w:sz w:val="18"/>
               </w:rPr>
-              <w:t>非阻断写作建议</w:t>
+              <w:t>Non-blocking writing suggestions</w:t>
             </w:r>
           </w:p>
         </w:tc>
@@ -9203,7 +9203,7 @@
                 <w:color w:val="000000"/>
                 <w:sz w:val="18"/>
               </w:rPr>
-              <w:t>自动保存</w:t>
+              <w:t>Auto-save</w:t>
             </w:r>
           </w:p>
         </w:tc>
@@ -9235,7 +9235,7 @@
                 <w:color w:val="000000"/>
                 <w:sz w:val="18"/>
               </w:rPr>
-              <w:t>停止输入约1秒</w:t>
+              <w:t>Stop input for about 1 second</w:t>
             </w:r>
           </w:p>
         </w:tc>
@@ -9267,7 +9267,7 @@
                 <w:color w:val="000000"/>
                 <w:sz w:val="18"/>
               </w:rPr>
-              <w:t>失败/冲突必须可见</w:t>
+              <w:t>Failures / conflicts must be visible</w:t>
             </w:r>
           </w:p>
         </w:tc>
@@ -9304,7 +9304,7 @@
                 <w:color w:val="000000"/>
                 <w:sz w:val="18"/>
               </w:rPr>
-              <w:t>同步轮询</w:t>
+              <w:t>Synchronous polling</w:t>
             </w:r>
           </w:p>
         </w:tc>
@@ -9336,7 +9336,7 @@
                 <w:color w:val="000000"/>
                 <w:sz w:val="18"/>
               </w:rPr>
-              <w:t>约2分钟</w:t>
+              <w:t>About 2 minutes</w:t>
             </w:r>
           </w:p>
         </w:tc>
@@ -9368,7 +9368,7 @@
                 <w:color w:val="000000"/>
                 <w:sz w:val="18"/>
               </w:rPr>
-              <w:t>按实际额度调整；非实时保证</w:t>
+              <w:t>Adjust by actual quota; non-real-time guarantee</w:t>
             </w:r>
           </w:p>
         </w:tc>
@@ -9405,7 +9405,7 @@
                 <w:color w:val="000000"/>
                 <w:sz w:val="18"/>
               </w:rPr>
-              <w:t>批量补充/生成</w:t>
+              <w:t>Batch enrichment / generation</w:t>
             </w:r>
           </w:p>
         </w:tc>
@@ -9437,7 +9437,7 @@
                 <w:color w:val="000000"/>
                 <w:sz w:val="18"/>
               </w:rPr>
-              <w:t>小批按需，服务端配置上限</w:t>
+              <w:t>Small batch on-demand, server-side configured upper limit</w:t>
             </w:r>
           </w:p>
         </w:tc>
@@ -9469,7 +9469,7 @@
                 <w:color w:val="000000"/>
                 <w:sz w:val="18"/>
               </w:rPr>
-              <w:t>不把账户额度硬编码为常量</w:t>
+              <w:t>Do not hardcode account quota as a constant</w:t>
             </w:r>
           </w:p>
         </w:tc>
@@ -9506,7 +9506,7 @@
                 <w:color w:val="000000"/>
                 <w:sz w:val="18"/>
               </w:rPr>
-              <w:t>所有产品状态</w:t>
+              <w:t>All product states</w:t>
             </w:r>
           </w:p>
         </w:tc>
@@ -9538,7 +9538,7 @@
                 <w:color w:val="000000"/>
                 <w:sz w:val="18"/>
               </w:rPr>
-              <w:t>功能表初始未开始</w:t>
+              <w:t>Feature table initially not started</w:t>
             </w:r>
           </w:p>
         </w:tc>
@@ -9570,7 +9570,7 @@
                 <w:color w:val="000000"/>
                 <w:sz w:val="18"/>
               </w:rPr>
-              <w:t>设计/演示完成不代表产品上线</w:t>
+              <w:t>Completion of design / demo does not mean product launch</w:t>
             </w:r>
           </w:p>
         </w:tc>
@@ -9587,12 +9587,12 @@
         <w:pStyle w:val="Heading1"/>
       </w:pPr>
       <w:r>
-        <w:t>15 验收与阶段交接</w:t>
+        <w:t>15 Acceptance and Phase Handover</w:t>
       </w:r>
     </w:p>
     <w:p>
       <w:r>
-        <w:t>每期验收同时覆盖成功路径与最可能导致数据丢失或误发的异常。外部凭据未提供时，区分代码已实现、Mock 已验证和真实未验证。HTML 演示的交互测试只证明演示可点击，不能替代 Gmail 或 AI 集成测试。</w:t>
+        <w:t>Each phase's acceptance covers both successful paths and the most likely causes of data loss or mis-sending. When external credentials are not provided, distinguish between code implemented, Mock verified, and live but unverified. HTML demos' interactive tests only prove the demo is clickable, not replace Gmail or AI integration tests.</w:t>
       </w:r>
     </w:p>
     <w:tbl>
@@ -9640,7 +9640,7 @@
                 <w:color w:val="FFFFFF"/>
                 <w:sz w:val="18"/>
               </w:rPr>
-              <w:t>期次</w:t>
+              <w:t>Phase</w:t>
             </w:r>
           </w:p>
         </w:tc>
@@ -9672,7 +9672,7 @@
                 <w:color w:val="FFFFFF"/>
                 <w:sz w:val="18"/>
               </w:rPr>
-              <w:t>必须通过的关键行为</w:t>
+              <w:t>Must pass critical behaviors</w:t>
             </w:r>
           </w:p>
         </w:tc>
@@ -9704,7 +9704,7 @@
                 <w:color w:val="FFFFFF"/>
                 <w:sz w:val="18"/>
               </w:rPr>
-              <w:t>交给下一期</w:t>
+              <w:t>Delegate to next phase</w:t>
             </w:r>
           </w:p>
         </w:tc>
@@ -9773,7 +9773,7 @@
                 <w:color w:val="000000"/>
                 <w:sz w:val="18"/>
               </w:rPr>
-              <w:t>画像确认、搜索来源、无事实编造、候选不覆盖、变量检查、草稿恢复</w:t>
+              <w:t>Persona confirmation, search source, no fact fabrication, candidates not override, variable check, draft recovery</w:t>
             </w:r>
           </w:p>
         </w:tc>
@@ -9805,7 +9805,7 @@
                 <w:color w:val="000000"/>
                 <w:sz w:val="18"/>
               </w:rPr>
-              <w:t>数据迁移、Provider、DraftRevision、README</w:t>
+              <w:t>Data migration, Provider, DraftRevision, README</w:t>
             </w:r>
           </w:p>
         </w:tc>
@@ -9874,7 +9874,7 @@
                 <w:color w:val="000000"/>
                 <w:sz w:val="18"/>
               </w:rPr>
-              <w:t>身份隔离、多Gmail、指定测试发信、定时取消、防重和unknown</w:t>
+              <w:t>Identity isolation, multi-Gmail, specified test sending, scheduled cancellation, prevention of duplicates and unknown</w:t>
             </w:r>
           </w:p>
         </w:tc>
@@ -9906,7 +9906,7 @@
                 <w:color w:val="000000"/>
                 <w:sz w:val="18"/>
               </w:rPr>
-              <w:t>MailProvider、SendJob、内容快照、脱敏验证记录</w:t>
+              <w:t>MailProvider, SendJob, content snapshot, redacted verification records</w:t>
             </w:r>
           </w:p>
         </w:tc>
@@ -9975,7 +9975,7 @@
                 <w:color w:val="000000"/>
                 <w:sz w:val="18"/>
               </w:rPr>
-              <w:t>增量恢复、原会话回复、暂停排期、到期只提醒、跨邮箱屏蔽</w:t>
+              <w:t>Incremental recovery, original session reply, pause scheduling, reminder only on expiration, cross-mailbox blocking</w:t>
             </w:r>
           </w:p>
         </w:tc>
@@ -10007,7 +10007,7 @@
                 <w:color w:val="000000"/>
                 <w:sz w:val="18"/>
               </w:rPr>
-              <w:t>Thread/Message、FollowUpTask、SuppressionEntry</w:t>
+              <w:t>Thread/Message, FollowUpTask, SuppressionEntry</w:t>
             </w:r>
           </w:p>
         </w:tc>
@@ -10076,7 +10076,7 @@
                 <w:color w:val="000000"/>
                 <w:sz w:val="18"/>
               </w:rPr>
-              <w:t>逐人预览批准、活动控制、真实统计、Academic未实现契约</w:t>
+              <w:t>Per-person preview approval, activity control, real statistics, Academic not implemented contract</w:t>
             </w:r>
           </w:p>
         </w:tc>
@@ -10108,7 +10108,7 @@
                 <w:color w:val="000000"/>
                 <w:sz w:val="18"/>
               </w:rPr>
-              <w:t>四期回归报告和外部上线事项</w:t>
+              <w:t>Phase 4 regression report and external launch matters</w:t>
             </w:r>
           </w:p>
         </w:tc>
@@ -10120,12 +10120,12 @@
         <w:pStyle w:val="Heading2"/>
       </w:pPr>
       <w:r>
-        <w:t>AI 写作专项</w:t>
+        <w:t>AI Writing Specialization</w:t>
       </w:r>
     </w:p>
     <w:p>
       <w:r>
-        <w:t>至少测试五类样本：事实完整、学校未知、资料冲突、用户要求编造、生成期间手动编辑。用固定输入确认关键字段与确定性校验，不把逐字匹配模型输出当质量测试。人工审阅语气与事实，程序检查 allowed_fact_ids、变量和 revision。</w:t>
+        <w:t>At least test five types of samples: complete facts, unknown schools, conflicting data, user requests to fabricate, and manual edits during generation. Use fixed inputs to confirm key fields and deterministic validation; do not treat exact model output matching as quality testing. Manual review of tone and facts, and program checks for allowed_fact_ids, variables, and revision.</w:t>
       </w:r>
     </w:p>
     <w:p>
@@ -10133,17 +10133,17 @@
         <w:pStyle w:val="Heading2"/>
       </w:pPr>
       <w:r>
-        <w:t>Prompt 使用方式</w:t>
+        <w:t>Prompt Usage</w:t>
       </w:r>
     </w:p>
     <w:p>
       <w:r>
-        <w:t>每一期 prompt 单独复制到同一代码库的新任务。附上本设计和功能清单更方便核对，但 prompt 本身包含约束与完成标准。新任务先读已有代码和上一期交付说明，基于迁移继续开发，不重建项目。未完成当前期的关键验收时，不能只因页面已存在就推进下一期。</w:t>
+        <w:t>Each phase's prompt is copied separately to a new task in the same codebase. Attaching this design and feature list makes verification easier, but the prompt itself includes constraints and completion standards. New tasks first read existing code and previous phase delivery notes, continuing development based on migration, not rebuilding the project. Do not advance to the next phase just because the page exists if the current phase's key acceptance is incomplete.</w:t>
       </w:r>
     </w:p>
     <w:p>
       <w:r>
-        <w:t>文件对应：prompt-01-mvp.md；prompt-02-mailboxes-send.md；prompt-03-inbox-followup.md；prompt-04-campaigns-polish.md。Excel 的功能清单可按期次筛选，状态和验证证据供开发过程更新。</w:t>
+        <w:t>Files correspond to: prompt-01-mvp.md; prompt-02-mailboxes-send.md; prompt-03-inbox-followup.md; prompt-04-campaigns-polish.md. The Excel feature list can be filtered by phase, and status and verification evidence are for development process updates.</w:t>
       </w:r>
     </w:p>
     <w:p>
@@ -10157,7 +10157,7 @@
         <w:spacing w:after="60"/>
       </w:pPr>
       <w:r>
-        <w:t>16 来源与设计决策</w:t>
+        <w:t>16 Sources and Design Decisions</w:t>
       </w:r>
     </w:p>
     <w:p>
@@ -10165,7 +10165,7 @@
         <w:spacing w:after="60"/>
       </w:pPr>
       <w:r>
-        <w:t>范围来自本次对话的明确选择。下列官方技术文档核对于 2026 年 9 月 6 日，仅用于确认接口边界；具体账户权限、套餐和公开上线要求仍需开发时核对。未对真实 Apollo、Gmail 或模型凭据进行调用验证。</w:t>
+        <w:t>Scope comes from explicit choices in this conversation. The following official technical documentation is verified as of September 6, 2026, and is only used to confirm interface boundaries; specific account permissions, plans, and public launch requirements still need to be verified during development. No real Apollo, Gmail, or model credentials are called or verified.</w:t>
       </w:r>
     </w:p>
     <w:p>
@@ -10174,7 +10174,7 @@
         <w:spacing w:after="60"/>
       </w:pPr>
       <w:r>
-        <w:t>S01 用户确认范围</w:t>
+        <w:t>S01 User Scope Confirmation</w:t>
       </w:r>
     </w:p>
     <w:p>
@@ -10182,7 +10182,7 @@
         <w:spacing w:after="60"/>
       </w:pPr>
       <w:r>
-        <w:t>个人多Gmail、英文默认、手动跟进、四期无自动序列</w:t>
+        <w:t>Personal multi-Gmail, English default, manual follow-up, four phases with no automated email sequence</w:t>
       </w:r>
     </w:p>
     <w:p>
@@ -10190,7 +10190,7 @@
         <w:spacing w:after="60"/>
       </w:pPr>
       <w:r>
-        <w:t>本对话 2026-09-06</w:t>
+        <w:t>This conversation 2026-09-06</w:t>
       </w:r>
     </w:p>
     <w:p>
@@ -10199,7 +10199,7 @@
         <w:spacing w:after="60"/>
       </w:pPr>
       <w:r>
-        <w:t>S02 Apollo 与 LinkedIn 公开搜索</w:t>
+        <w:t>S02 Apollo and LinkedIn Public Search</w:t>
       </w:r>
     </w:p>
     <w:p>
@@ -10207,7 +10207,7 @@
         <w:spacing w:after="60"/>
       </w:pPr>
       <w:r>
-        <w:t>Apollo 人员搜索与邮箱补充分离；SerpAPI 经 Google 检索 LinkedIn 公开页，覆盖取决于索引。双源协同待实现验证</w:t>
+        <w:t>Apollo people search and email enrichment are separated; SerpAPI is indexed via Google for LinkedIn public pages, coverage depends on indexing. Dual-source collaboration is pending verification</w:t>
       </w:r>
     </w:p>
     <w:p>
@@ -10226,7 +10226,7 @@
         <w:spacing w:after="60"/>
       </w:pPr>
       <w:r>
-        <w:t>S03 Gmail OAuth 权限</w:t>
+        <w:t>S03 Gmail OAuth Permissions</w:t>
       </w:r>
     </w:p>
     <w:p>
@@ -10234,7 +10234,7 @@
         <w:spacing w:after="60"/>
       </w:pPr>
       <w:r>
-        <w:t>按实际功能申请；公开验证独立于本地开发</w:t>
+        <w:t>Apply based on actual functionality; public verification is independent of local development</w:t>
       </w:r>
     </w:p>
     <w:p>
@@ -10251,7 +10251,7 @@
         <w:spacing w:after="60"/>
       </w:pPr>
       <w:r>
-        <w:t>S04 Gmail 同步</w:t>
+        <w:t>S04 Gmail Synchronization</w:t>
       </w:r>
     </w:p>
     <w:p>
@@ -10259,7 +10259,7 @@
         <w:spacing w:after="60"/>
       </w:pPr>
       <w:r>
-        <w:t>初次和增量同步；游标失效需要恢复</w:t>
+        <w:t>Initial and incremental synchronization; cursor failure requires recovery</w:t>
       </w:r>
     </w:p>
     <w:p>
@@ -10276,7 +10276,7 @@
         <w:spacing w:after="60"/>
       </w:pPr>
       <w:r>
-        <w:t>S05 Gmail 会话</w:t>
+        <w:t>S05 Gmail Session</w:t>
       </w:r>
     </w:p>
     <w:p>
@@ -10284,7 +10284,7 @@
         <w:spacing w:after="60"/>
       </w:pPr>
       <w:r>
-        <w:t>回复保留threadId和消息头关系</w:t>
+        <w:t>Reply retains threadId and message header relationship</w:t>
       </w:r>
     </w:p>
     <w:p>
@@ -10301,7 +10301,7 @@
         <w:spacing w:after="60"/>
       </w:pPr>
       <w:r>
-        <w:t>S06 Tiptap Mention 扩展</w:t>
+        <w:t>S06 Tiptap Mention Extension</w:t>
       </w:r>
     </w:p>
     <w:p>
@@ -10309,7 +10309,7 @@
         <w:spacing w:after="60"/>
       </w:pPr>
       <w:r>
-        <w:t>参考节点交互机制；变量节点需自定义设计</w:t>
+        <w:t>Reference node interaction mechanism; variable nodes require custom design</w:t>
       </w:r>
     </w:p>
     <w:p>
@@ -10326,7 +10326,7 @@
         <w:spacing w:after="60"/>
       </w:pPr>
       <w:r>
-        <w:t>本版明确采用的设计决策</w:t>
+        <w:t>This version's explicit design decisions</w:t>
       </w:r>
     </w:p>
     <w:p>
@@ -10334,7 +10334,7 @@
         <w:spacing w:after="60"/>
       </w:pPr>
       <w:r>
-        <w:t>账户与工作区认证放在第二期，而非第四期，避免 Gmail 数据归属返工。第一期采用模块化单体，不提前搭建自动化基础设施。AI 候选与正文分开，人工采纳是内容写入边界。批量活动在回复保护之后接入，降低已有回复却继续批量排期的风险。</w:t>
+        <w:t>Account and workspace authentication is placed in Phase 2, not Phase 4, to avoid Gmail data ownership rework. Phase 1 uses a modular monolith, not building automated infrastructure in advance. AI candidates and body are separated, and manual adoption is the content writing boundary. Batch activities are introduced after reply protection to reduce the risk of existing replies continuing to be batch scheduled.</w:t>
       </w:r>
     </w:p>
     <w:p>
@@ -10342,7 +10342,7 @@
         <w:spacing w:after="60"/>
       </w:pPr>
       <w:r>
-        <w:t>这些设计默认值可在实施中调整，但应同步更新 Word、功能清单及后续 prompt。任何新增自动序列、团队权限或真实 Academic 搜索都需要新一期明确范围。</w:t>
+        <w:t>These design defaults can be adjusted during implementation, but should be synchronized with Word, feature list, and subsequent prompts. Any new automated email sequence, team permissions, or real Academic search requires a new phase to define scope.</w:t>
       </w:r>
     </w:p>
     <w:p>
@@ -10358,12 +10358,12 @@
         <w:pStyle w:val="Heading1"/>
       </w:pPr>
       <w:r>
-        <w:t>17 管理员后端 Soon 排期</w:t>
+        <w:t>17 Administrator Backend Soon Schedule</w:t>
       </w:r>
     </w:p>
     <w:p>
       <w:r>
-        <w:t>管理员后端列入 Soon 待开发范围，具体期次和日期待定，不计入 P1–P4 的交付门槛。当前仅展示规划入口及页面说明，不实现管理操作。第一期的简历、找人、写信与草稿闭环保持不变。</w:t>
+        <w:t>Administrator backend is included in Soon development scope, with specific phases and dates to be determined, not counted in P1–P4 delivery thresholds. Currently, only the planning entry and page description are shown, without implementing management operations. The first phase's resume, find person, write letter, and draft loop remains unchanged.</w:t>
       </w:r>
     </w:p>
     <w:tbl>
@@ -10410,7 +10410,7 @@
                 <w:color w:val="FFFFFF"/>
                 <w:sz w:val="18"/>
               </w:rPr>
-              <w:t>规划页面</w:t>
+              <w:t>Planning page</w:t>
             </w:r>
           </w:p>
         </w:tc>
@@ -10442,7 +10442,7 @@
                 <w:color w:val="FFFFFF"/>
                 <w:sz w:val="18"/>
               </w:rPr>
-              <w:t>主要功能</w:t>
+              <w:t>Main features</w:t>
             </w:r>
           </w:p>
         </w:tc>
@@ -10479,7 +10479,7 @@
                 <w:color w:val="000000"/>
                 <w:sz w:val="18"/>
               </w:rPr>
-              <w:t>运行概览</w:t>
+              <w:t>Overview of operation</w:t>
             </w:r>
           </w:p>
         </w:tc>
@@ -10511,7 +10511,7 @@
                 <w:color w:val="000000"/>
                 <w:sz w:val="18"/>
               </w:rPr>
-              <w:t>用户、邮箱故障、排队和失败任务汇总，支持下钻</w:t>
+              <w:t>Summary of users, email failures, queued and failed tasks, supports drilling down</w:t>
             </w:r>
           </w:p>
         </w:tc>
@@ -10548,7 +10548,7 @@
                 <w:color w:val="000000"/>
                 <w:sz w:val="18"/>
               </w:rPr>
-              <w:t>用户管理</w:t>
+              <w:t>User management</w:t>
             </w:r>
           </w:p>
         </w:tc>
@@ -10580,7 +10580,7 @@
                 <w:color w:val="000000"/>
                 <w:sz w:val="18"/>
               </w:rPr>
-              <w:t>查询账户与工作区状态，停用和恢复账户</w:t>
+              <w:t>Query account and workspace status, disable and re-enable account</w:t>
             </w:r>
           </w:p>
         </w:tc>
@@ -10617,7 +10617,7 @@
                 <w:color w:val="000000"/>
                 <w:sz w:val="18"/>
               </w:rPr>
-              <w:t>邮箱连接</w:t>
+              <w:t>Email connection</w:t>
             </w:r>
           </w:p>
         </w:tc>
@@ -10649,7 +10649,7 @@
                 <w:color w:val="000000"/>
                 <w:sz w:val="18"/>
               </w:rPr>
-              <w:t>查看归属、授权状态、同步错误；暂停相关任务</w:t>
+              <w:t>View ownership, authorization status, sync errors; pause related tasks</w:t>
             </w:r>
           </w:p>
         </w:tc>
@@ -10686,7 +10686,7 @@
                 <w:color w:val="000000"/>
                 <w:sz w:val="18"/>
               </w:rPr>
-              <w:t>发送任务</w:t>
+              <w:t>Send task</w:t>
             </w:r>
           </w:p>
         </w:tc>
@@ -10718,7 +10718,7 @@
                 <w:color w:val="000000"/>
                 <w:sz w:val="18"/>
               </w:rPr>
-              <w:t>筛选排队、定时、失败与 unknown 任务；暂停和取消</w:t>
+              <w:t>Filter queued, scheduled, failed and unknown tasks; pause and cancel</w:t>
             </w:r>
           </w:p>
         </w:tc>
@@ -10755,7 +10755,7 @@
                 <w:color w:val="000000"/>
                 <w:sz w:val="18"/>
               </w:rPr>
-              <w:t>服务与 AI 配置</w:t>
+              <w:t>Service and AI configuration</w:t>
             </w:r>
           </w:p>
         </w:tc>
@@ -10787,7 +10787,7 @@
                 <w:color w:val="000000"/>
                 <w:sz w:val="18"/>
               </w:rPr>
-              <w:t>管理提供商连接、模型、额度、超时及重试参数</w:t>
+              <w:t>Manage provider connections, models, quotas, timeouts and retry parameters</w:t>
             </w:r>
           </w:p>
         </w:tc>
@@ -10824,7 +10824,7 @@
                 <w:color w:val="000000"/>
                 <w:sz w:val="18"/>
               </w:rPr>
-              <w:t>同步任务</w:t>
+              <w:t>Synchronization task</w:t>
             </w:r>
           </w:p>
         </w:tc>
@@ -10856,7 +10856,7 @@
                 <w:color w:val="000000"/>
                 <w:sz w:val="18"/>
               </w:rPr>
-              <w:t>查看同步游标、延迟与错误，执行受控恢复</w:t>
+              <w:t>View sync cursor, delay and errors, execute controlled recovery</w:t>
             </w:r>
           </w:p>
         </w:tc>
@@ -10893,7 +10893,7 @@
                 <w:color w:val="000000"/>
                 <w:sz w:val="18"/>
               </w:rPr>
-              <w:t>平台模板与提示词</w:t>
+              <w:t>Platform templates and prompts</w:t>
             </w:r>
           </w:p>
         </w:tc>
@@ -10925,7 +10925,7 @@
                 <w:color w:val="000000"/>
                 <w:sz w:val="18"/>
               </w:rPr>
-              <w:t>测试、发布和回滚平台模板及 AI 提示词版本</w:t>
+              <w:t>Test, publish and rollback platform templates and AI prompt versions</w:t>
             </w:r>
           </w:p>
         </w:tc>
@@ -10962,7 +10962,7 @@
                 <w:color w:val="000000"/>
                 <w:sz w:val="18"/>
               </w:rPr>
-              <w:t>用量与成本</w:t>
+              <w:t>Usage and cost</w:t>
             </w:r>
           </w:p>
         </w:tc>
@@ -10994,7 +10994,7 @@
                 <w:color w:val="000000"/>
                 <w:sz w:val="18"/>
               </w:rPr>
-              <w:t>按用户、日期及提供商查看调用量和成本</w:t>
+              <w:t>View usage and cost by user, date and provider</w:t>
             </w:r>
           </w:p>
         </w:tc>
@@ -11031,7 +11031,7 @@
                 <w:color w:val="000000"/>
                 <w:sz w:val="18"/>
               </w:rPr>
-              <w:t>审计与平台设置</w:t>
+              <w:t>Audit and platform settings</w:t>
             </w:r>
           </w:p>
         </w:tc>
@@ -11063,7 +11063,7 @@
                 <w:color w:val="000000"/>
                 <w:sz w:val="18"/>
               </w:rPr>
-              <w:t>查询管理操作日志，管理默认限制与功能开关</w:t>
+              <w:t>Query management operation logs, manage default limits and feature switches</w:t>
             </w:r>
           </w:p>
         </w:tc>
@@ -11075,17 +11075,17 @@
         <w:pStyle w:val="Heading2"/>
       </w:pPr>
       <w:r>
-        <w:t>访问与操作边界</w:t>
+        <w:t>Access and Operation Boundaries</w:t>
       </w:r>
     </w:p>
     <w:p>
       <w:r>
-        <w:t>正式实现时使用独立管理入口及服务端平台角色校验。个人工作区 Owner 不自动具有平台管理员权限。默认只展示元数据和脱敏错误；查看简历或邮件正文需要单独受控且可审计的权限。密钥与 OAuth Token 不回显。</w:t>
+        <w:t>Use an independent management entry and server-side platform role verification when officially implemented. Personal workspace Owner does not automatically have platform administrator permissions. By default, only metadata and sanitized errors are shown; viewing resumes or email bodies requires separate, controlled, and auditable permissions. Keys and OAuth Tokens are not echoed.</w:t>
       </w:r>
     </w:p>
     <w:p>
       <w:r>
-        <w:t>管理员不能代用户完成 Gmail 授权；unknown 发送结果须先核对，不能直接重发。模板或提示词修改不影响已批准内容。账户恢复与任务恢复分开处理，防止意外重新发送。</w:t>
+        <w:t>Administrators cannot complete Gmail authorization on behalf of users; unknown send results must be verified first, and cannot be resent directly. Template or prompt modifications do not affect approved content. Account recovery and task recovery are handled separately to prevent accidental resending.</w:t>
       </w:r>
     </w:p>
     <w:p>
@@ -11093,12 +11093,12 @@
         <w:pStyle w:val="Heading2"/>
       </w:pPr>
       <w:r>
-        <w:t>后续启动条件</w:t>
+        <w:t>Subsequent Launch Conditions</w:t>
       </w:r>
     </w:p>
     <w:p>
       <w:r>
-        <w:t>正式账户、平台角色和对应业务模块就绪后，再确定管理后台的实现期次与独立开发 Prompt。四份现有 Prompt 只声明 Soon 边界；XLSX 可筛选 Soon 查看九项待办，完成率与四期分别统计。</w:t>
+        <w:t>Official accounts, platform roles, and corresponding business modules are ready before determining the implementation phase and independent development prompt for the management backend. The four existing prompts only declare the Soon boundary; XLSX can filter Soon to view nine pending tasks, with completion rate and four phases separately tracked.</w:t>
       </w:r>
     </w:p>
     <w:sectPr>
@@ -11121,7 +11121,7 @@
       <w:jc w:val="right"/>
     </w:pPr>
     <w:r>
-      <w:t xml:space="preserve">设计版本 1.2     </w:t>
+      <w:t xml:space="preserve">Design version 1.2     </w:t>
     </w:r>
     <w:fldSimple w:instr="PAGE"/>
   </w:p>
@@ -11138,7 +11138,7 @@
       <w:rPr>
         <w:sz w:val="16"/>
       </w:rPr>
-      <w:t>Connact.ai   /   产品与工程设计   /   2026 09 06</w:t>
+      <w:t>Connact.ai   /   Product and Engineering Design   /   2026 09 06</w:t>
     </w:r>
   </w:p>
 </w:hdr>

</xml_diff>